<commit_message>
Update of phase 1 documents
</commit_message>
<xml_diff>
--- a/docs/phase_1/Fase_1_Equipo04.docx
+++ b/docs/phase_1/Fase_1_Equipo04.docx
@@ -295,92 +295,442 @@
     <w:p>
       <w:pPr>
         <w:pStyle w:val="ReportBody"/>
-      </w:pPr>
-      <w:r>
-        <w:rPr/>
+        <w:spacing w:after="80"/>
+      </w:pPr>
+      <w:r>
+        <w:rPr>
+          <w:sz w:val="21"/>
+        </w:rPr>
         <w:t xml:space="preserve">El proyecto MiBici aborda el pronóstico de viajes iniciados por estación y por hora para el día siguiente, con el objetivo de apoyar la planeación del rebalanceo de bicicletas. La propuesta busca aportar información sobre dónde y cuándo se concentrarán las salidas. El pronóstico será un insumo para la operación; no determina por sí solo el inventario requerido ni las rutas de los vehículos de rebalanceo.</w:t>
       </w:r>
     </w:p>
     <w:p>
       <w:pPr>
         <w:pStyle w:val="ReportBody"/>
-      </w:pPr>
-      <w:r>
-        <w:rPr/>
+        <w:spacing w:after="80"/>
+      </w:pPr>
+      <w:r>
+        <w:rPr>
+          <w:sz w:val="21"/>
+        </w:rPr>
         <w:t xml:space="preserve">En la Fase 1 se construyó una base reproducible para ese problema a partir de los datos abiertos de MiBici. Se adquirieron 142 archivos mensuales de viajes y una nomenclatura de estaciones, con un histórico de diciembre de 2014 a septiembre de 2026 y 39,078,984 registros originales. La preparación normalizó formatos, tipos, faltantes y fechas; agregó linaje y marcas de calidad; y eliminó únicamente 758 duplicados exactos. El resultado fue </w:t>
       </w:r>
       <w:r>
         <w:rPr>
-          <w:sz w:val="19"/>
+          <w:sz w:val="21"/>
           <w:color w:val="254960"/>
           <w:rFonts w:ascii="DejaVu Sans Mono" w:hAnsi="DejaVu Sans Mono"/>
         </w:rPr>
         <w:t xml:space="preserve">interim_v1</w:t>
       </w:r>
       <w:r>
-        <w:rPr/>
+        <w:rPr>
+          <w:sz w:val="21"/>
+        </w:rPr>
         <w:t xml:space="preserve">, con 39,078,226 viajes.</w:t>
       </w:r>
     </w:p>
     <w:p>
       <w:pPr>
         <w:pStyle w:val="ReportBody"/>
-      </w:pPr>
-      <w:r>
-        <w:rPr/>
+        <w:spacing w:after="80"/>
+      </w:pPr>
+      <w:r>
+        <w:rPr>
+          <w:sz w:val="21"/>
+        </w:rPr>
         <w:t xml:space="preserve">El equipo desarrolló análisis independientes de patrones temporales, estacionalidad y anomalías, y expansión de estaciones. La integración contrastó sus hallazgos con una base estación × hora y permitió definir el periodo desde enero de 2022, las horas de servicio y las reglas de conteo del target. Se conservaron las estaciones nuevas y los días extraordinarios, incorporando marcas para su evaluación posterior. Los viajes excluidos del target permanecen en interim.</w:t>
       </w:r>
     </w:p>
     <w:p>
       <w:pPr>
         <w:pStyle w:val="ReportBody"/>
-      </w:pPr>
-      <w:r>
-        <w:rPr/>
+        <w:spacing w:after="80"/>
+      </w:pPr>
+      <w:r>
+        <w:rPr>
+          <w:sz w:val="21"/>
+        </w:rPr>
         <w:t xml:space="preserve">El dataset resultante, </w:t>
       </w:r>
       <w:r>
         <w:rPr>
-          <w:sz w:val="19"/>
+          <w:sz w:val="21"/>
           <w:color w:val="254960"/>
           <w:rFonts w:ascii="DejaVu Sans Mono" w:hAnsi="DejaVu Sans Mono"/>
         </w:rPr>
         <w:t xml:space="preserve">processed_v1</w:t>
       </w:r>
       <w:r>
-        <w:rPr/>
+        <w:rPr>
+          <w:sz w:val="21"/>
+        </w:rPr>
         <w:t xml:space="preserve">, contiene 11,949,160 observaciones de estación × hora, 473 estaciones representadas durante el periodo y 20,296,886 salidas. Cada estación-día elegible cuenta con 20 intervalos de servicio; el 42.8 % de las observaciones registra cero salidas. Su conciliación con los viajes intermedios permite explicar cada exclusión sin pérdidas de registros no documentadas.</w:t>
       </w:r>
     </w:p>
     <w:p>
       <w:pPr>
         <w:pStyle w:val="ReportBody"/>
-      </w:pPr>
-      <w:r>
-        <w:rPr/>
+        <w:spacing w:after="80"/>
+      </w:pPr>
+      <w:r>
+        <w:rPr>
+          <w:sz w:val="21"/>
+        </w:rPr>
         <w:t xml:space="preserve">La trazabilidad se implementó con Git y MLflow: versiones de código, reglas, métricas, reportes, referencias de datasets y huellas de datos. La lógica reutilizable reside en módulos Python y se ejecuta mediante Makefile en el ambiente Conda </w:t>
       </w:r>
       <w:r>
         <w:rPr>
-          <w:sz w:val="19"/>
+          <w:sz w:val="21"/>
           <w:color w:val="254960"/>
           <w:rFonts w:ascii="DejaVu Sans Mono" w:hAnsi="DejaVu Sans Mono"/>
         </w:rPr>
         <w:t xml:space="preserve">mibici</w:t>
       </w:r>
       <w:r>
-        <w:rPr/>
+        <w:rPr>
+          <w:sz w:val="21"/>
+        </w:rPr>
         <w:t xml:space="preserve">. La verificación técnica confirmó 31 pruebas satisfactorias y revisiones de Ruff sin errores. El trabajo de preparación e integración quedó incorporado a la rama principal del repositorio público mediante Pull Requests que conservan las contribuciones individuales.</w:t>
       </w:r>
     </w:p>
     <w:p>
       <w:pPr>
         <w:pStyle w:val="ReportBody"/>
-      </w:pPr>
-      <w:r>
-        <w:rPr/>
+        <w:spacing w:after="80"/>
+      </w:pPr>
+      <w:r>
+        <w:rPr>
+          <w:sz w:val="21"/>
+        </w:rPr>
         <w:t xml:space="preserve">La fase deja datos y componentes preparados para iniciar el modelado. No se entrenó un modelo final ni se midió un beneficio operativo. La disponibilidad mensual de los datos públicos limita el proyecto a una simulación histórica del contrato diario hasta contar con una fuente más oportuna.</w:t>
       </w:r>
+    </w:p>
+    <w:p>
+      <w:pPr>
+        <w:pStyle w:val="ReportBody"/>
+        <w:spacing w:after="80"/>
+      </w:pPr>
+      <w:r>
+        <w:rPr>
+          <w:sz w:val="21"/>
+        </w:rPr>
+        <w:t xml:space="preserve">La correspondencia entre la actividad académica y el contenido del reporte es la siguiente:</w:t>
+      </w:r>
+    </w:p>
+    <w:tbl>
+      <w:tblPr>
+        <w:tblW w:w="9972" w:type="dxa"/>
+        <w:tblLayout w:type="fixed"/>
+        <w:tblCellMar>
+          <w:top w:w="60" w:type="dxa"/>
+          <w:left w:w="60" w:type="dxa"/>
+          <w:bottom w:w="60" w:type="dxa"/>
+          <w:right w:w="60" w:type="dxa"/>
+        </w:tblCellMar>
+        <w:tblBorders>
+          <w:top w:val="single" w:sz="4" w:color="D5DFE6"/>
+          <w:left w:val="single" w:sz="4" w:color="D5DFE6"/>
+          <w:bottom w:val="single" w:sz="4" w:color="D5DFE6"/>
+          <w:right w:val="single" w:sz="4" w:color="D5DFE6"/>
+          <w:insideH w:val="single" w:sz="4" w:color="D5DFE6"/>
+          <w:insideV w:val="single" w:sz="4" w:color="D5DFE6"/>
+        </w:tblBorders>
+      </w:tblPr>
+      <w:tblGrid>
+        <w:gridCol w:w="4287"/>
+        <w:gridCol w:w="5684"/>
+      </w:tblGrid>
+      <w:tr>
+        <w:trPr>
+          <w:cantSplit/>
+          <w:tblHeader/>
+        </w:trPr>
+        <w:tc>
+          <w:tcPr>
+            <w:tcW w:w="4287" w:type="dxa"/>
+            <w:vAlign w:val="center"/>
+            <w:shd w:fill="E3EDF4"/>
+          </w:tcPr>
+          <w:p>
+            <w:pPr>
+              <w:pStyle w:val="ReportTable"/>
+            </w:pPr>
+            <w:r>
+              <w:rPr>
+                <w:b/>
+                <w:sz w:val="17"/>
+              </w:rPr>
+              <w:t xml:space="preserve">Etapa de la actividad</w:t>
+            </w:r>
+          </w:p>
+        </w:tc>
+        <w:tc>
+          <w:tcPr>
+            <w:tcW w:w="5684" w:type="dxa"/>
+            <w:vAlign w:val="center"/>
+            <w:shd w:fill="E3EDF4"/>
+          </w:tcPr>
+          <w:p>
+            <w:pPr>
+              <w:pStyle w:val="ReportTable"/>
+            </w:pPr>
+            <w:r>
+              <w:rPr>
+                <w:b/>
+                <w:sz w:val="17"/>
+              </w:rPr>
+              <w:t xml:space="preserve">Sección del reporte</w:t>
+            </w:r>
+          </w:p>
+        </w:tc>
+      </w:tr>
+      <w:tr>
+        <w:trPr>
+          <w:cantSplit/>
+        </w:trPr>
+        <w:tc>
+          <w:tcPr>
+            <w:tcW w:w="4287" w:type="dxa"/>
+            <w:vAlign w:val="center"/>
+          </w:tcPr>
+          <w:p>
+            <w:pPr>
+              <w:pStyle w:val="ReportTable"/>
+            </w:pPr>
+            <w:r>
+              <w:rPr>
+                <w:sz w:val="17"/>
+              </w:rPr>
+              <w:t xml:space="preserve">1. Análisis de requerimientos</w:t>
+            </w:r>
+          </w:p>
+        </w:tc>
+        <w:tc>
+          <w:tcPr>
+            <w:tcW w:w="5684" w:type="dxa"/>
+            <w:vAlign w:val="center"/>
+          </w:tcPr>
+          <w:p>
+            <w:pPr>
+              <w:pStyle w:val="ReportTable"/>
+            </w:pPr>
+            <w:r>
+              <w:rPr>
+                <w:sz w:val="17"/>
+              </w:rPr>
+              <w:t xml:space="preserve">2</w:t>
+            </w:r>
+          </w:p>
+        </w:tc>
+      </w:tr>
+      <w:tr>
+        <w:trPr>
+          <w:cantSplit/>
+        </w:trPr>
+        <w:tc>
+          <w:tcPr>
+            <w:tcW w:w="4287" w:type="dxa"/>
+            <w:vAlign w:val="center"/>
+            <w:shd w:fill="F5F8FA"/>
+          </w:tcPr>
+          <w:p>
+            <w:pPr>
+              <w:pStyle w:val="ReportTable"/>
+            </w:pPr>
+            <w:r>
+              <w:rPr>
+                <w:sz w:val="17"/>
+              </w:rPr>
+              <w:t xml:space="preserve">2. Manipulación y preparación de datos</w:t>
+            </w:r>
+          </w:p>
+        </w:tc>
+        <w:tc>
+          <w:tcPr>
+            <w:tcW w:w="5684" w:type="dxa"/>
+            <w:vAlign w:val="center"/>
+            <w:shd w:fill="F5F8FA"/>
+          </w:tcPr>
+          <w:p>
+            <w:pPr>
+              <w:pStyle w:val="ReportTable"/>
+            </w:pPr>
+            <w:r>
+              <w:rPr>
+                <w:sz w:val="17"/>
+              </w:rPr>
+              <w:t xml:space="preserve">3</w:t>
+            </w:r>
+          </w:p>
+        </w:tc>
+      </w:tr>
+      <w:tr>
+        <w:trPr>
+          <w:cantSplit/>
+        </w:trPr>
+        <w:tc>
+          <w:tcPr>
+            <w:tcW w:w="4287" w:type="dxa"/>
+            <w:vAlign w:val="center"/>
+          </w:tcPr>
+          <w:p>
+            <w:pPr>
+              <w:pStyle w:val="ReportTable"/>
+            </w:pPr>
+            <w:r>
+              <w:rPr>
+                <w:sz w:val="17"/>
+              </w:rPr>
+              <w:t xml:space="preserve">3. Exploración y preprocesamiento</w:t>
+            </w:r>
+          </w:p>
+        </w:tc>
+        <w:tc>
+          <w:tcPr>
+            <w:tcW w:w="5684" w:type="dxa"/>
+            <w:vAlign w:val="center"/>
+          </w:tcPr>
+          <w:p>
+            <w:pPr>
+              <w:pStyle w:val="ReportTable"/>
+            </w:pPr>
+            <w:r>
+              <w:rPr>
+                <w:sz w:val="17"/>
+              </w:rPr>
+              <w:t xml:space="preserve">4, 5 y 6</w:t>
+            </w:r>
+          </w:p>
+        </w:tc>
+      </w:tr>
+      <w:tr>
+        <w:trPr>
+          <w:cantSplit/>
+        </w:trPr>
+        <w:tc>
+          <w:tcPr>
+            <w:tcW w:w="4287" w:type="dxa"/>
+            <w:vAlign w:val="center"/>
+            <w:shd w:fill="F5F8FA"/>
+          </w:tcPr>
+          <w:p>
+            <w:pPr>
+              <w:pStyle w:val="ReportTable"/>
+            </w:pPr>
+            <w:r>
+              <w:rPr>
+                <w:sz w:val="17"/>
+              </w:rPr>
+              <w:t xml:space="preserve">4. Versionado de datos</w:t>
+            </w:r>
+          </w:p>
+        </w:tc>
+        <w:tc>
+          <w:tcPr>
+            <w:tcW w:w="5684" w:type="dxa"/>
+            <w:vAlign w:val="center"/>
+            <w:shd w:fill="F5F8FA"/>
+          </w:tcPr>
+          <w:p>
+            <w:pPr>
+              <w:pStyle w:val="ReportTable"/>
+            </w:pPr>
+            <w:r>
+              <w:rPr>
+                <w:sz w:val="17"/>
+              </w:rPr>
+              <w:t xml:space="preserve">7</w:t>
+            </w:r>
+          </w:p>
+        </w:tc>
+      </w:tr>
+      <w:tr>
+        <w:trPr>
+          <w:cantSplit/>
+        </w:trPr>
+        <w:tc>
+          <w:tcPr>
+            <w:tcW w:w="4287" w:type="dxa"/>
+            <w:vAlign w:val="center"/>
+          </w:tcPr>
+          <w:p>
+            <w:pPr>
+              <w:pStyle w:val="ReportTable"/>
+            </w:pPr>
+            <w:r>
+              <w:rPr>
+                <w:sz w:val="17"/>
+              </w:rPr>
+              <w:t xml:space="preserve">5. Estructuración y refactorización</w:t>
+            </w:r>
+          </w:p>
+        </w:tc>
+        <w:tc>
+          <w:tcPr>
+            <w:tcW w:w="5684" w:type="dxa"/>
+            <w:vAlign w:val="center"/>
+          </w:tcPr>
+          <w:p>
+            <w:pPr>
+              <w:pStyle w:val="ReportTable"/>
+            </w:pPr>
+            <w:r>
+              <w:rPr>
+                <w:sz w:val="17"/>
+              </w:rPr>
+              <w:t xml:space="preserve">8</w:t>
+            </w:r>
+          </w:p>
+        </w:tc>
+      </w:tr>
+      <w:tr>
+        <w:trPr>
+          <w:cantSplit/>
+        </w:trPr>
+        <w:tc>
+          <w:tcPr>
+            <w:tcW w:w="4287" w:type="dxa"/>
+            <w:vAlign w:val="center"/>
+            <w:shd w:fill="F5F8FA"/>
+          </w:tcPr>
+          <w:p>
+            <w:pPr>
+              <w:pStyle w:val="ReportTable"/>
+            </w:pPr>
+            <w:r>
+              <w:rPr>
+                <w:sz w:val="17"/>
+              </w:rPr>
+              <w:t xml:space="preserve">Roles, GitHub, resultados, conclusiones y uso de IA</w:t>
+            </w:r>
+          </w:p>
+        </w:tc>
+        <w:tc>
+          <w:tcPr>
+            <w:tcW w:w="5684" w:type="dxa"/>
+            <w:vAlign w:val="center"/>
+            <w:shd w:fill="F5F8FA"/>
+          </w:tcPr>
+          <w:p>
+            <w:pPr>
+              <w:pStyle w:val="ReportTable"/>
+            </w:pPr>
+            <w:r>
+              <w:rPr>
+                <w:sz w:val="17"/>
+              </w:rPr>
+              <w:t xml:space="preserve">9 a 13</w:t>
+            </w:r>
+          </w:p>
+        </w:tc>
+      </w:tr>
+    </w:tbl>
+    <w:p>
+      <w:pPr>
+        <w:pStyle w:val="ReportBody"/>
+        <w:spacing w:before="0" w:after="80"/>
+      </w:pPr>
     </w:p>
     <w:p>
       <w:pPr>
@@ -939,7 +1289,7 @@
         <w:rPr>
           <w:color w:val="15658B"/>
         </w:rPr>
-        <w:t xml:space="preserve">ML Canvas v3</w:t>
+        <w:t xml:space="preserve">ML Canvas v4</w:t>
       </w:r>
       <w:r>
         <w:rPr/>
@@ -1212,13 +1562,13 @@
       <w:r>
         <w:drawing>
           <wp:inline distT="0" distB="0" distL="0" distR="0">
-            <wp:extent cx="6682853" cy="5166360"/>
-            <wp:docPr id="32" name="report_ML_Canvas_MiBici_Equipo04_v3.png" descr="ML Canvas v3 del proyecto MiBici"/>
+            <wp:extent cx="6685877" cy="5166360"/>
+            <wp:docPr id="32" name="report_ML_Canvas_MiBici_Equipo04_v4.png" descr="ML Canvas v4 del proyecto MiBici"/>
             <a:graphic>
               <a:graphicData uri="http://schemas.openxmlformats.org/drawingml/2006/picture">
                 <pic:pic>
                   <pic:nvPicPr>
-                    <pic:cNvPr id="32" name="report_ML_Canvas_MiBici_Equipo04_v3.png"/>
+                    <pic:cNvPr id="32" name="report_ML_Canvas_MiBici_Equipo04_v4.png"/>
                     <pic:cNvPicPr/>
                   </pic:nvPicPr>
                   <pic:blipFill>
@@ -1230,7 +1580,7 @@
                   <pic:spPr>
                     <a:xfrm>
                       <a:off x="0" y="0"/>
-                      <a:ext cx="6682853" cy="5166360"/>
+                      <a:ext cx="6685877" cy="5166360"/>
                     </a:xfrm>
                     <a:prstGeom prst="rect">
                       <a:avLst/>
@@ -1251,7 +1601,7 @@
         <w:rPr>
           <w:b/>
         </w:rPr>
-        <w:t xml:space="preserve">Figura 1. ML Canvas v3 del Equipo 04.</w:t>
+        <w:t xml:space="preserve">Figura 1. ML Canvas v4 del Equipo 04.</w:t>
       </w:r>
       <w:r>
         <w:rPr/>
@@ -2645,21 +2995,26 @@
     <w:p>
       <w:pPr>
         <w:pStyle w:val="ReportBody"/>
-      </w:pPr>
-      <w:r>
-        <w:rPr/>
+        <w:spacing w:after="80"/>
+      </w:pPr>
+      <w:r>
+        <w:rPr>
+          <w:sz w:val="21"/>
+        </w:rPr>
         <w:t xml:space="preserve">El EDA se distribuyó en tres preguntas independientes y una integración. Todos parten de </w:t>
       </w:r>
       <w:r>
         <w:rPr>
-          <w:sz w:val="19"/>
+          <w:sz w:val="21"/>
           <w:color w:val="254960"/>
           <w:rFonts w:ascii="DejaVu Sans Mono" w:hAnsi="DejaVu Sans Mono"/>
         </w:rPr>
         <w:t xml:space="preserve">interim_v1</w:t>
       </w:r>
       <w:r>
-        <w:rPr/>
+        <w:rPr>
+          <w:sz w:val="21"/>
+        </w:rPr>
         <w:t xml:space="preserve">; las exclusiones finales se deciden después de examinar la evidencia.</w:t>
       </w:r>
     </w:p>
@@ -2675,18 +3030,24 @@
     <w:p>
       <w:pPr>
         <w:pStyle w:val="ReportBody"/>
-      </w:pPr>
-      <w:r>
-        <w:rPr/>
+        <w:spacing w:after="80"/>
+      </w:pPr>
+      <w:r>
+        <w:rPr>
+          <w:sz w:val="21"/>
+        </w:rPr>
         <w:t xml:space="preserve">El notebook 1.01 estudia cómo cambian las salidas por hora y día de la semana. Calcula promedios diarios para evitar comparar totales afectados por el número de días observados y contrasta perfiles normalizados de 2018–2019 y 2024–2026. Su periodo de análisis general es 2018–2026.</w:t>
       </w:r>
     </w:p>
     <w:p>
       <w:pPr>
         <w:pStyle w:val="ReportBody"/>
-      </w:pPr>
-      <w:r>
-        <w:rPr/>
+        <w:spacing w:after="80"/>
+      </w:pPr>
+      <w:r>
+        <w:rPr>
+          <w:sz w:val="21"/>
+        </w:rPr>
         <w:t xml:space="preserve">Los resultados muestran dos picos en días laborales, alrededor de las 08:00 y las 18:00, mientras que el fin de semana concentra más actividad hacia el mediodía. Los perfiles agregados apoyan mantener resolución horaria e incluir calendario. Las explicaciones relacionadas con trabajo, escuela o recreación son interpretaciones; el dataset no registra el motivo del viaje.</w:t>
       </w:r>
     </w:p>
@@ -2694,7 +3055,7 @@
       <w:pPr>
         <w:pStyle w:val="ReportBody"/>
         <w:jc w:val="center"/>
-        <w:spacing w:before="80" w:after="50"/>
+        <w:spacing w:before="80" w:after="80"/>
         <w:keepNext/>
       </w:pPr>
       <w:r>
@@ -2743,15 +3104,18 @@
       </w:r>
       <w:r>
         <w:rPr/>
-        <w:t xml:space="preserve"> Fuente: notebook 1.01, José Eduardo. Los patrones corresponden al conjunto de la red y no prueban que todas las estaciones compartan la misma forma.</w:t>
-      </w:r>
-    </w:p>
-    <w:p>
-      <w:pPr>
-        <w:pStyle w:val="ReportBody"/>
-      </w:pPr>
-      <w:r>
-        <w:rPr/>
+        <w:t xml:space="preserve"> Fuente: José Eduardo (figura 1.01d del notebook 1.01). Los patrones corresponden al conjunto de la red y no prueban que todas las estaciones compartan la misma forma.</w:t>
+      </w:r>
+    </w:p>
+    <w:p>
+      <w:pPr>
+        <w:pStyle w:val="ReportBody"/>
+        <w:spacing w:after="80"/>
+      </w:pPr>
+      <w:r>
+        <w:rPr>
+          <w:sz w:val="21"/>
+        </w:rPr>
         <w:t xml:space="preserve">El resumen temporal se genera desde interim mediante la lógica incorporada en el PR #6. El notebook integrador realiza además una verificación desde la base común: reproduce los picos principales y obtiene una correlación aproximada de 0.98 entre perfiles laborales de los periodos comparados. Esto respalda similitud de forma, no igualdad de volúmenes ni estabilidad individual de cada estación.</w:t>
       </w:r>
     </w:p>
@@ -2767,18 +3131,24 @@
     <w:p>
       <w:pPr>
         <w:pStyle w:val="ReportBody"/>
-      </w:pPr>
-      <w:r>
-        <w:rPr/>
+        <w:spacing w:after="80"/>
+      </w:pPr>
+      <w:r>
+        <w:rPr>
+          <w:sz w:val="21"/>
+        </w:rPr>
         <w:t xml:space="preserve">El notebook 1.02 analiza cambios mensuales, anuales y días atípicos. Para separar parcialmente crecimiento de la red y actividad, calcula salidas por día y estación con salidas observadas. Normaliza cada mes respecto del promedio de su año y compara 2020–2021 con los mismos meses de 2019.</w:t>
       </w:r>
     </w:p>
     <w:p>
       <w:pPr>
         <w:pStyle w:val="ReportBody"/>
-      </w:pPr>
-      <w:r>
-        <w:rPr/>
+        <w:spacing w:after="80"/>
+      </w:pPr>
+      <w:r>
+        <w:rPr>
+          <w:sz w:val="21"/>
+        </w:rPr>
         <w:t xml:space="preserve">El índice estacional de referencia sitúa octubre alrededor de 1.11 y diciembre en 0.88. Abril de 2020 registra aproximadamente 64 % menos actividad por día y estación que abril de 2019, seguido por una recuperación prolongada. La evidencia permite distinguir el periodo 2020–2021 y proponer una ventana inicial desde 2022, sin demostrar todavía que sea la ventana predictiva óptima.</w:t>
       </w:r>
     </w:p>
@@ -2786,7 +3156,7 @@
       <w:pPr>
         <w:pStyle w:val="ReportBody"/>
         <w:jc w:val="center"/>
-        <w:spacing w:before="80" w:after="50"/>
+        <w:spacing w:before="80" w:after="80"/>
         <w:keepNext/>
       </w:pPr>
       <w:r>
@@ -2841,18 +3211,24 @@
     <w:p>
       <w:pPr>
         <w:pStyle w:val="ReportBody"/>
-      </w:pPr>
-      <w:r>
-        <w:rPr/>
+        <w:spacing w:after="80"/>
+      </w:pPr>
+      <w:r>
+        <w:rPr>
+          <w:sz w:val="21"/>
+        </w:rPr>
         <w:t xml:space="preserve">La detección diaria compara cada fecha con la mediana de hasta ocho semanas previas del mismo día de la semana, con mínimo de cuatro observaciones. Los cocientes inferiores a 0.5 o superiores a 1.5 identifican 136 días atípicos: 105 bajos y 31 altos. Las reglas de calendario y la hipótesis del periodo inicial de la pandemia clasifican 97 casos bajos como comportamiento real; esta clasificación no implica comprobación causal individual.</w:t>
       </w:r>
     </w:p>
     <w:p>
       <w:pPr>
         <w:pStyle w:val="ReportBody"/>
-      </w:pPr>
-      <w:r>
-        <w:rPr/>
+        <w:spacing w:after="80"/>
+      </w:pPr>
+      <w:r>
+        <w:rPr>
+          <w:sz w:val="21"/>
+        </w:rPr>
         <w:t xml:space="preserve">La integración conserva los días reales y marca los eventos extraordinarios. También reconoce que un detector de totales puede confundir una expansión de estaciones con una anomalía y que la diferencia entre primer y último viaje no demuestra cobertura completa durante el día.</w:t>
       </w:r>
     </w:p>
@@ -2868,18 +3244,24 @@
     <w:p>
       <w:pPr>
         <w:pStyle w:val="ReportBody"/>
-      </w:pPr>
-      <w:r>
-        <w:rPr/>
+        <w:spacing w:after="80"/>
+      </w:pPr>
+      <w:r>
+        <w:rPr>
+          <w:sz w:val="21"/>
+        </w:rPr>
         <w:t xml:space="preserve">El notebook 1.03 compara estaciones nuevas y consolidadas durante enero–septiembre de 2026. Normaliza por exposición estimada, analiza cohortes y estudia meses desde la primera actividad observada. Las nuevas no tienen la misma cantidad de historia ni exposición que las consolidadas.</w:t>
       </w:r>
     </w:p>
     <w:p>
       <w:pPr>
         <w:pStyle w:val="ReportBody"/>
-      </w:pPr>
-      <w:r>
-        <w:rPr/>
+        <w:spacing w:after="80"/>
+      </w:pPr>
+      <w:r>
+        <w:rPr>
+          <w:sz w:val="21"/>
+        </w:rPr>
         <w:t xml:space="preserve">Con exposición mensual, las nuevas registran 9.18 salidas por estación-día frente a 32.53 de las consolidadas. El contraste de 1.04 con bordes por día ajusta la intensidad de las nuevas a 10.89 y su porcentaje de ceros de 78.57 % a 74.57 %. Las consolidadas conservan valores redondeados de 32.53 salidas y 53.58 % de ceros. Las cifras todavía incluyen las 24 horas del día, antes de la restricción de servicio de processed.</w:t>
       </w:r>
     </w:p>
@@ -2887,7 +3269,7 @@
       <w:pPr>
         <w:pStyle w:val="ReportBody"/>
         <w:jc w:val="center"/>
-        <w:spacing w:before="80" w:after="50"/>
+        <w:spacing w:before="80" w:after="80"/>
         <w:keepNext/>
       </w:pPr>
       <w:r>
@@ -2936,15 +3318,18 @@
       </w:r>
       <w:r>
         <w:rPr/>
-        <w:t xml:space="preserve"> Fuente: notebook 1.03, José Emmanuel. El número de estaciones disminuye con la edad observada: el punto de edad cuatro meses reúne solo 12 estaciones y no establece un tiempo universal de maduración.</w:t>
-      </w:r>
-    </w:p>
-    <w:p>
-      <w:pPr>
-        <w:pStyle w:val="ReportBody"/>
-      </w:pPr>
-      <w:r>
-        <w:rPr/>
+        <w:t xml:space="preserve"> Fuente: José Emmanuel (figura 2 del notebook 1.03). El número de estaciones disminuye con la edad observada: el punto de edad cuatro meses reúne solo 12 estaciones y no establece un tiempo universal de maduración.</w:t>
+      </w:r>
+    </w:p>
+    <w:p>
+      <w:pPr>
+        <w:pStyle w:val="ReportBody"/>
+        <w:spacing w:after="80"/>
+      </w:pPr>
+      <w:r>
+        <w:rPr>
+          <w:sz w:val="21"/>
+        </w:rPr>
         <w:t xml:space="preserve">La comparación mensual incluye días anteriores a la primera actividad dentro del mes inicial y puede sobrestimar ceros. Aun con el ajuste por día, las nuevas presentan menor intensidad. Esto respalda conservarlas y evaluar su desempeño por separado, sin atribuir toda la diferencia a la antigüedad: localización, calendario y disponibilidad también pueden influir.</w:t>
       </w:r>
     </w:p>
@@ -2960,72 +3345,90 @@
     <w:p>
       <w:pPr>
         <w:pStyle w:val="ReportBody"/>
-      </w:pPr>
-      <w:r>
-        <w:rPr/>
+        <w:spacing w:after="80"/>
+      </w:pPr>
+      <w:r>
+        <w:rPr>
+          <w:sz w:val="21"/>
+        </w:rPr>
         <w:t xml:space="preserve">La integración del notebook 1.04 estuvo a cargo de Leonardo Santos García. Las decisiones corresponden al Equipo 04: José Eduardo De Moraes López, Erik Román Cortez, José Emmanuel Vázquez Galán y Leonardo Santos García, con base en la evidencia de los cuatro notebooks. Leonardo integró y documentó esas decisiones y las conectó con su implementación.</w:t>
       </w:r>
     </w:p>
     <w:p>
       <w:pPr>
         <w:pStyle w:val="ReportBody"/>
-      </w:pPr>
-      <w:r>
-        <w:rPr/>
+        <w:spacing w:after="80"/>
+      </w:pPr>
+      <w:r>
+        <w:rPr>
+          <w:sz w:val="21"/>
+        </w:rPr>
         <w:t xml:space="preserve">El notebook 1.04 valida </w:t>
       </w:r>
       <w:r>
         <w:rPr>
-          <w:sz w:val="19"/>
+          <w:sz w:val="21"/>
           <w:color w:val="254960"/>
           <w:rFonts w:ascii="DejaVu Sans Mono" w:hAnsi="DejaVu Sans Mono"/>
         </w:rPr>
         <w:t xml:space="preserve">station_hour_base</w:t>
       </w:r>
       <w:r>
-        <w:rPr/>
+        <w:rPr>
+          <w:sz w:val="21"/>
+        </w:rPr>
         <w:t xml:space="preserve">, revisa estaciones representativas, examina distribución del target, rezagos, viajes cortos y horario, y relaciona hallazgos del equipo con las decisiones de procesamiento. Reutiliza figuras, la lista de días atípicos y tablas guardadas en los notebooks, con referencias a sus celdas.</w:t>
       </w:r>
     </w:p>
     <w:p>
       <w:pPr>
         <w:pStyle w:val="ReportBody"/>
-      </w:pPr>
-      <w:r>
-        <w:rPr/>
+        <w:spacing w:after="80"/>
+      </w:pPr>
+      <w:r>
+        <w:rPr>
+          <w:sz w:val="21"/>
+        </w:rPr>
         <w:t xml:space="preserve">La base de análisis contiene 54.41 % de ceros y una varianza aproximadamente 4.6 veces la media. Estos resultados describen heterogeneidad y dispersión; no bastan para decidir una distribución condicional o un algoritmo. La revisión de picos locales evita eliminar registros únicamente por su magnitud.</w:t>
       </w:r>
     </w:p>
     <w:p>
       <w:pPr>
         <w:pStyle w:val="ReportBody"/>
-      </w:pPr>
-      <w:r>
-        <w:rPr/>
+        <w:spacing w:after="80"/>
+      </w:pPr>
+      <w:r>
+        <w:rPr>
+          <w:sz w:val="21"/>
+        </w:rPr>
         <w:t xml:space="preserve">La comparación exploratoria de predictores sobre </w:t>
       </w:r>
       <w:r>
         <w:rPr>
-          <w:sz w:val="19"/>
+          <w:sz w:val="21"/>
           <w:color w:val="254960"/>
           <w:rFonts w:ascii="DejaVu Sans Mono" w:hAnsi="DejaVu Sans Mono"/>
         </w:rPr>
         <w:t xml:space="preserve">station_hour_base</w:t>
       </w:r>
       <w:r>
-        <w:rPr/>
+        <w:rPr>
+          <w:sz w:val="21"/>
+        </w:rPr>
         <w:t xml:space="preserve">, en 2025–2026, obtiene WAPE de 0.625 para el promedio de las últimas cuatro semanas, 0.730 para el rezago semanal, 1.000 para siempre cero y 1.182 para el promedio constante anterior a 2025. Las coberturas de rezagos difieren. El promedio de cuatro semanas para la misma estación, día de la semana y hora se selecciona como referencia predictiva para evaluar posteriormente los modelos de la Fase 2, en concordancia con el ML Canvas. Su valor 0.625 es exploratorio: no corresponde a un modelo final ni a una evaluación recalculada sobre </w:t>
       </w:r>
       <w:r>
         <w:rPr>
-          <w:sz w:val="19"/>
+          <w:sz w:val="21"/>
           <w:color w:val="254960"/>
           <w:rFonts w:ascii="DejaVu Sans Mono" w:hAnsi="DejaVu Sans Mono"/>
         </w:rPr>
         <w:t xml:space="preserve">processed_v1</w:t>
       </w:r>
       <w:r>
-        <w:rPr/>
+        <w:rPr>
+          <w:sz w:val="21"/>
+        </w:rPr>
         <w:t xml:space="preserve">.</w:t>
       </w:r>
     </w:p>
@@ -3354,7 +3757,22 @@
               <w:rPr>
                 <w:sz w:val="18"/>
               </w:rPr>
-              <w:t xml:space="preserve">Horario publicado de 05:00 a 00:59 y baja actividad observada de madrugada</w:t>
+              <w:t xml:space="preserve">Horario publicado por MiBici: todos los días de 05:00 a 00:59 (</w:t>
+            </w:r>
+            <w:hyperlink r:id="rId37">
+              <w:r>
+                <w:rPr>
+                  <w:sz w:val="18"/>
+                  <w:color w:val="15658B"/>
+                </w:rPr>
+                <w:t xml:space="preserve">fuente oficial</w:t>
+              </w:r>
+            </w:hyperlink>
+            <w:r>
+              <w:rPr>
+                <w:sz w:val="18"/>
+              </w:rPr>
+              <w:t xml:space="preserve">) y baja actividad observada de madrugada</w:t>
             </w:r>
           </w:p>
         </w:tc>
@@ -3724,7 +4142,19 @@
       </w:r>
       <w:r>
         <w:rPr/>
-        <w:t xml:space="preserve"> derivado del día de semana. Las transformaciones aprendidas deberán ajustarse únicamente con entrenamiento cuando corresponda.</w:t>
+        <w:t xml:space="preserve"> derivado del día de semana. Las transformaciones aprendidas deberán ajustarse únicamente con entrenamiento cuando corresponda. En la Fase 2, la codificación de las variables de calendario dependerá del modelo: para modelos lineales, el notebook 1.01 recomienda una codificación cíclica de hora y día de la semana. </w:t>
+      </w:r>
+      <w:r>
+        <w:rPr>
+          <w:sz w:val="19"/>
+          <w:color w:val="254960"/>
+          <w:rFonts w:ascii="DejaVu Sans Mono" w:hAnsi="DejaVu Sans Mono"/>
+        </w:rPr>
+        <w:t xml:space="preserve">station_id</w:t>
+      </w:r>
+      <w:r>
+        <w:rPr/>
+        <w:t xml:space="preserve"> es un identificador y no una magnitud.</w:t>
       </w:r>
     </w:p>
     <w:p>
@@ -5596,10 +6026,10 @@
         </w:tblBorders>
       </w:tblPr>
       <w:tblGrid>
-        <w:gridCol w:w="2193"/>
-        <w:gridCol w:w="2592"/>
-        <w:gridCol w:w="1495"/>
-        <w:gridCol w:w="3689"/>
+        <w:gridCol w:w="1695"/>
+        <w:gridCol w:w="2094"/>
+        <w:gridCol w:w="3091"/>
+        <w:gridCol w:w="3091"/>
       </w:tblGrid>
       <w:tr>
         <w:trPr>
@@ -5608,7 +6038,7 @@
         </w:trPr>
         <w:tc>
           <w:tcPr>
-            <w:tcW w:w="2193" w:type="dxa"/>
+            <w:tcW w:w="1695" w:type="dxa"/>
             <w:vAlign w:val="center"/>
             <w:shd w:fill="E3EDF4"/>
           </w:tcPr>
@@ -5627,7 +6057,7 @@
         </w:tc>
         <w:tc>
           <w:tcPr>
-            <w:tcW w:w="2592" w:type="dxa"/>
+            <w:tcW w:w="2094" w:type="dxa"/>
             <w:vAlign w:val="center"/>
             <w:shd w:fill="E3EDF4"/>
           </w:tcPr>
@@ -5646,7 +6076,7 @@
         </w:tc>
         <w:tc>
           <w:tcPr>
-            <w:tcW w:w="1495" w:type="dxa"/>
+            <w:tcW w:w="3091" w:type="dxa"/>
             <w:vAlign w:val="center"/>
             <w:shd w:fill="E3EDF4"/>
           </w:tcPr>
@@ -5665,7 +6095,7 @@
         </w:tc>
         <w:tc>
           <w:tcPr>
-            <w:tcW w:w="3689" w:type="dxa"/>
+            <w:tcW w:w="3091" w:type="dxa"/>
             <w:vAlign w:val="center"/>
             <w:shd w:fill="E3EDF4"/>
           </w:tcPr>
@@ -5689,7 +6119,7 @@
         </w:trPr>
         <w:tc>
           <w:tcPr>
-            <w:tcW w:w="2193" w:type="dxa"/>
+            <w:tcW w:w="1695" w:type="dxa"/>
             <w:vAlign w:val="center"/>
           </w:tcPr>
           <w:p>
@@ -5708,7 +6138,7 @@
         </w:tc>
         <w:tc>
           <w:tcPr>
-            <w:tcW w:w="2592" w:type="dxa"/>
+            <w:tcW w:w="2094" w:type="dxa"/>
             <w:vAlign w:val="center"/>
           </w:tcPr>
           <w:p>
@@ -5727,7 +6157,7 @@
         </w:tc>
         <w:tc>
           <w:tcPr>
-            <w:tcW w:w="1495" w:type="dxa"/>
+            <w:tcW w:w="3091" w:type="dxa"/>
             <w:vAlign w:val="center"/>
           </w:tcPr>
           <w:p>
@@ -5744,7 +6174,7 @@
         </w:tc>
         <w:tc>
           <w:tcPr>
-            <w:tcW w:w="3689" w:type="dxa"/>
+            <w:tcW w:w="3091" w:type="dxa"/>
             <w:vAlign w:val="center"/>
           </w:tcPr>
           <w:p>
@@ -5766,7 +6196,7 @@
         </w:trPr>
         <w:tc>
           <w:tcPr>
-            <w:tcW w:w="2193" w:type="dxa"/>
+            <w:tcW w:w="1695" w:type="dxa"/>
             <w:vAlign w:val="center"/>
             <w:shd w:fill="F5F8FA"/>
           </w:tcPr>
@@ -5786,7 +6216,7 @@
         </w:tc>
         <w:tc>
           <w:tcPr>
-            <w:tcW w:w="2592" w:type="dxa"/>
+            <w:tcW w:w="2094" w:type="dxa"/>
             <w:vAlign w:val="center"/>
             <w:shd w:fill="F5F8FA"/>
           </w:tcPr>
@@ -5806,7 +6236,7 @@
         </w:tc>
         <w:tc>
           <w:tcPr>
-            <w:tcW w:w="1495" w:type="dxa"/>
+            <w:tcW w:w="3091" w:type="dxa"/>
             <w:vAlign w:val="center"/>
             <w:shd w:fill="F5F8FA"/>
           </w:tcPr>
@@ -5824,7 +6254,7 @@
         </w:tc>
         <w:tc>
           <w:tcPr>
-            <w:tcW w:w="3689" w:type="dxa"/>
+            <w:tcW w:w="3091" w:type="dxa"/>
             <w:vAlign w:val="center"/>
             <w:shd w:fill="F5F8FA"/>
           </w:tcPr>
@@ -5847,6 +6277,51 @@
         <w:pStyle w:val="ReportBody"/>
         <w:spacing w:before="0" w:after="20"/>
       </w:pPr>
+    </w:p>
+    <w:p>
+      <w:pPr>
+        <w:pStyle w:val="ReportBody"/>
+      </w:pPr>
+      <w:r>
+        <w:rPr/>
+        <w:t xml:space="preserve">Una corrida anterior de </w:t>
+      </w:r>
+      <w:r>
+        <w:rPr>
+          <w:sz w:val="19"/>
+          <w:color w:val="254960"/>
+          <w:rFonts w:ascii="DejaVu Sans Mono" w:hAnsi="DejaVu Sans Mono"/>
+        </w:rPr>
+        <w:t xml:space="preserve">interim_v1</w:t>
+      </w:r>
+      <w:r>
+        <w:rPr/>
+        <w:t xml:space="preserve"> (commit </w:t>
+      </w:r>
+      <w:r>
+        <w:rPr>
+          <w:sz w:val="19"/>
+          <w:color w:val="254960"/>
+          <w:rFonts w:ascii="DejaVu Sans Mono" w:hAnsi="DejaVu Sans Mono"/>
+        </w:rPr>
+        <w:t xml:space="preserve">cac4bde</w:t>
+      </w:r>
+      <w:r>
+        <w:rPr/>
+        <w:t xml:space="preserve">) registra las mismas métricas con otro método de digest y se conserva como historial; la versión vigente es la del commit </w:t>
+      </w:r>
+      <w:r>
+        <w:rPr>
+          <w:sz w:val="19"/>
+          <w:color w:val="254960"/>
+          <w:rFonts w:ascii="DejaVu Sans Mono" w:hAnsi="DejaVu Sans Mono"/>
+        </w:rPr>
+        <w:t xml:space="preserve">aaa2397</w:t>
+      </w:r>
+      <w:r>
+        <w:rPr/>
+        <w:t xml:space="preserve">.</w:t>
+      </w:r>
     </w:p>
     <w:p>
       <w:pPr>
@@ -5859,16 +6334,16 @@
         <w:drawing>
           <wp:inline distT="0" distB="0" distL="0" distR="0">
             <wp:extent cx="6263640" cy="3174654"/>
-            <wp:docPr id="37" name="report_processed_v1-mlflow-overview.png" descr="Registro de la corrida de processed_v1"/>
+            <wp:docPr id="38" name="report_processed_v1-mlflow-overview.png" descr="Registro de la corrida de processed_v1"/>
             <a:graphic>
               <a:graphicData uri="http://schemas.openxmlformats.org/drawingml/2006/picture">
                 <pic:pic>
                   <pic:nvPicPr>
-                    <pic:cNvPr id="37" name="report_processed_v1-mlflow-overview.png"/>
+                    <pic:cNvPr id="38" name="report_processed_v1-mlflow-overview.png"/>
                     <pic:cNvPicPr/>
                   </pic:nvPicPr>
                   <pic:blipFill>
-                    <a:blip r:embed="rId37"/>
+                    <a:blip r:embed="rId38"/>
                     <a:stretch>
                       <a:fillRect/>
                     </a:stretch>
@@ -5951,12 +6426,12 @@
         <w:rPr/>
         <w:t xml:space="preserve">. El equipo proporciona además una </w:t>
       </w:r>
-      <w:hyperlink r:id="rId38">
+      <w:hyperlink r:id="rId39">
         <w:r>
           <w:rPr>
             <w:color w:val="15658B"/>
           </w:rPr>
-          <w:t xml:space="preserve">carpeta de consulta con las imágenes de MLflow de `interim_v1`</w:t>
+          <w:t xml:space="preserve">carpeta de consulta con las imágenes de MLflow de interim_v1</w:t>
         </w:r>
       </w:hyperlink>
       <w:r>
@@ -5996,12 +6471,12 @@
         <w:rPr/>
         <w:t xml:space="preserve"> y en la </w:t>
       </w:r>
-      <w:hyperlink r:id="rId39">
+      <w:hyperlink r:id="rId40">
         <w:r>
           <w:rPr>
             <w:color w:val="15658B"/>
           </w:rPr>
-          <w:t xml:space="preserve">carpeta de consulta con las imágenes de MLflow de `processed_v1`</w:t>
+          <w:t xml:space="preserve">carpeta de consulta con las imágenes de MLflow de processed_v1</w:t>
         </w:r>
       </w:hyperlink>
       <w:r>
@@ -6568,6 +7043,545 @@
       <w:r>
         <w:rPr/>
         <w:t xml:space="preserve">Los roles se entienden como responsabilidades del ciclo MLOps y no como puestos exclusivos. Una persona puede participar en varias funciones.</w:t>
+      </w:r>
+    </w:p>
+    <w:tbl>
+      <w:tblPr>
+        <w:tblW w:w="9972" w:type="dxa"/>
+        <w:tblLayout w:type="fixed"/>
+        <w:tblCellMar>
+          <w:top w:w="85" w:type="dxa"/>
+          <w:left w:w="85" w:type="dxa"/>
+          <w:bottom w:w="85" w:type="dxa"/>
+          <w:right w:w="85" w:type="dxa"/>
+        </w:tblCellMar>
+        <w:tblBorders>
+          <w:top w:val="single" w:sz="4" w:color="D5DFE6"/>
+          <w:left w:val="single" w:sz="4" w:color="D5DFE6"/>
+          <w:bottom w:val="single" w:sz="4" w:color="D5DFE6"/>
+          <w:right w:val="single" w:sz="4" w:color="D5DFE6"/>
+          <w:insideH w:val="single" w:sz="4" w:color="D5DFE6"/>
+          <w:insideV w:val="single" w:sz="4" w:color="D5DFE6"/>
+        </w:tblBorders>
+      </w:tblPr>
+      <w:tblGrid>
+        <w:gridCol w:w="1695"/>
+        <w:gridCol w:w="2094"/>
+        <w:gridCol w:w="3091"/>
+        <w:gridCol w:w="3091"/>
+      </w:tblGrid>
+      <w:tr>
+        <w:trPr>
+          <w:cantSplit/>
+          <w:tblHeader/>
+        </w:trPr>
+        <w:tc>
+          <w:tcPr>
+            <w:tcW w:w="1695" w:type="dxa"/>
+            <w:vAlign w:val="center"/>
+            <w:shd w:fill="E3EDF4"/>
+          </w:tcPr>
+          <w:p>
+            <w:pPr>
+              <w:pStyle w:val="ReportTable"/>
+            </w:pPr>
+            <w:r>
+              <w:rPr>
+                <w:b/>
+                <w:sz w:val="18"/>
+              </w:rPr>
+              <w:t xml:space="preserve">Rol</w:t>
+            </w:r>
+          </w:p>
+        </w:tc>
+        <w:tc>
+          <w:tcPr>
+            <w:tcW w:w="2094" w:type="dxa"/>
+            <w:vAlign w:val="center"/>
+            <w:shd w:fill="E3EDF4"/>
+          </w:tcPr>
+          <w:p>
+            <w:pPr>
+              <w:pStyle w:val="ReportTable"/>
+            </w:pPr>
+            <w:r>
+              <w:rPr>
+                <w:b/>
+                <w:sz w:val="18"/>
+              </w:rPr>
+              <w:t xml:space="preserve">Etapa MLOps</w:t>
+            </w:r>
+          </w:p>
+        </w:tc>
+        <w:tc>
+          <w:tcPr>
+            <w:tcW w:w="3091" w:type="dxa"/>
+            <w:vAlign w:val="center"/>
+            <w:shd w:fill="E3EDF4"/>
+          </w:tcPr>
+          <w:p>
+            <w:pPr>
+              <w:pStyle w:val="ReportTable"/>
+            </w:pPr>
+            <w:r>
+              <w:rPr>
+                <w:b/>
+                <w:sz w:val="18"/>
+              </w:rPr>
+              <w:t xml:space="preserve">Responsables y actividades</w:t>
+            </w:r>
+          </w:p>
+        </w:tc>
+        <w:tc>
+          <w:tcPr>
+            <w:tcW w:w="3091" w:type="dxa"/>
+            <w:vAlign w:val="center"/>
+            <w:shd w:fill="E3EDF4"/>
+          </w:tcPr>
+          <w:p>
+            <w:pPr>
+              <w:pStyle w:val="ReportTable"/>
+            </w:pPr>
+            <w:r>
+              <w:rPr>
+                <w:b/>
+                <w:sz w:val="18"/>
+              </w:rPr>
+              <w:t xml:space="preserve">Evidencia e interacción</w:t>
+            </w:r>
+          </w:p>
+        </w:tc>
+      </w:tr>
+      <w:tr>
+        <w:trPr>
+          <w:cantSplit/>
+        </w:trPr>
+        <w:tc>
+          <w:tcPr>
+            <w:tcW w:w="1695" w:type="dxa"/>
+            <w:vAlign w:val="center"/>
+          </w:tcPr>
+          <w:p>
+            <w:pPr>
+              <w:pStyle w:val="ReportTable"/>
+            </w:pPr>
+            <w:r>
+              <w:rPr>
+                <w:sz w:val="18"/>
+              </w:rPr>
+              <w:t xml:space="preserve">Data Engineer</w:t>
+            </w:r>
+          </w:p>
+        </w:tc>
+        <w:tc>
+          <w:tcPr>
+            <w:tcW w:w="2094" w:type="dxa"/>
+            <w:vAlign w:val="center"/>
+          </w:tcPr>
+          <w:p>
+            <w:pPr>
+              <w:pStyle w:val="ReportTable"/>
+            </w:pPr>
+            <w:r>
+              <w:rPr>
+                <w:sz w:val="18"/>
+              </w:rPr>
+              <w:t xml:space="preserve">Ingesta y preparación de datos</w:t>
+            </w:r>
+          </w:p>
+        </w:tc>
+        <w:tc>
+          <w:tcPr>
+            <w:tcW w:w="3091" w:type="dxa"/>
+            <w:vAlign w:val="center"/>
+          </w:tcPr>
+          <w:p>
+            <w:pPr>
+              <w:pStyle w:val="ReportTable"/>
+            </w:pPr>
+            <w:r>
+              <w:rPr>
+                <w:sz w:val="18"/>
+              </w:rPr>
+              <w:t xml:space="preserve">Leonardo: adquisición, perfilado, preparación, linaje y actividad de estaciones</w:t>
+            </w:r>
+          </w:p>
+        </w:tc>
+        <w:tc>
+          <w:tcPr>
+            <w:tcW w:w="3091" w:type="dxa"/>
+            <w:vAlign w:val="center"/>
+          </w:tcPr>
+          <w:p>
+            <w:pPr>
+              <w:pStyle w:val="ReportTable"/>
+            </w:pPr>
+            <w:r>
+              <w:rPr>
+                <w:sz w:val="18"/>
+              </w:rPr>
+              <w:t xml:space="preserve">Entrega interim como insumo común al EDA; incorpora las reglas acordadas de calidad y exposición</w:t>
+            </w:r>
+          </w:p>
+        </w:tc>
+      </w:tr>
+      <w:tr>
+        <w:trPr>
+          <w:cantSplit/>
+        </w:trPr>
+        <w:tc>
+          <w:tcPr>
+            <w:tcW w:w="1695" w:type="dxa"/>
+            <w:vAlign w:val="center"/>
+            <w:shd w:fill="F5F8FA"/>
+          </w:tcPr>
+          <w:p>
+            <w:pPr>
+              <w:pStyle w:val="ReportTable"/>
+            </w:pPr>
+            <w:r>
+              <w:rPr>
+                <w:sz w:val="18"/>
+              </w:rPr>
+              <w:t xml:space="preserve">Data Scientist</w:t>
+            </w:r>
+          </w:p>
+        </w:tc>
+        <w:tc>
+          <w:tcPr>
+            <w:tcW w:w="2094" w:type="dxa"/>
+            <w:vAlign w:val="center"/>
+            <w:shd w:fill="F5F8FA"/>
+          </w:tcPr>
+          <w:p>
+            <w:pPr>
+              <w:pStyle w:val="ReportTable"/>
+            </w:pPr>
+            <w:r>
+              <w:rPr>
+                <w:sz w:val="18"/>
+              </w:rPr>
+              <w:t xml:space="preserve">Exploración y decisiones sobre el target</w:t>
+            </w:r>
+          </w:p>
+        </w:tc>
+        <w:tc>
+          <w:tcPr>
+            <w:tcW w:w="3091" w:type="dxa"/>
+            <w:vAlign w:val="center"/>
+            <w:shd w:fill="F5F8FA"/>
+          </w:tcPr>
+          <w:p>
+            <w:pPr>
+              <w:pStyle w:val="ReportTable"/>
+            </w:pPr>
+            <w:r>
+              <w:rPr>
+                <w:sz w:val="18"/>
+              </w:rPr>
+              <w:t xml:space="preserve">José Eduardo: patrones temporales; Erik: estacionalidad y anomalías; José Emmanuel: expansión; Leonardo: integración del target</w:t>
+            </w:r>
+          </w:p>
+        </w:tc>
+        <w:tc>
+          <w:tcPr>
+            <w:tcW w:w="3091" w:type="dxa"/>
+            <w:vAlign w:val="center"/>
+            <w:shd w:fill="F5F8FA"/>
+          </w:tcPr>
+          <w:p>
+            <w:pPr>
+              <w:pStyle w:val="ReportTable"/>
+            </w:pPr>
+            <w:r>
+              <w:rPr>
+                <w:sz w:val="18"/>
+              </w:rPr>
+              <w:t xml:space="preserve">Notebooks 1.01–1.04; sus hallazgos alimentan las decisiones del procesamiento</w:t>
+            </w:r>
+          </w:p>
+        </w:tc>
+      </w:tr>
+      <w:tr>
+        <w:trPr>
+          <w:cantSplit/>
+        </w:trPr>
+        <w:tc>
+          <w:tcPr>
+            <w:tcW w:w="1695" w:type="dxa"/>
+            <w:vAlign w:val="center"/>
+          </w:tcPr>
+          <w:p>
+            <w:pPr>
+              <w:pStyle w:val="ReportTable"/>
+            </w:pPr>
+            <w:r>
+              <w:rPr>
+                <w:sz w:val="18"/>
+              </w:rPr>
+              <w:t xml:space="preserve">Software Engineer</w:t>
+            </w:r>
+          </w:p>
+        </w:tc>
+        <w:tc>
+          <w:tcPr>
+            <w:tcW w:w="2094" w:type="dxa"/>
+            <w:vAlign w:val="center"/>
+          </w:tcPr>
+          <w:p>
+            <w:pPr>
+              <w:pStyle w:val="ReportTable"/>
+            </w:pPr>
+            <w:r>
+              <w:rPr>
+                <w:sz w:val="18"/>
+              </w:rPr>
+              <w:t xml:space="preserve">Código modular y pruebas</w:t>
+            </w:r>
+          </w:p>
+        </w:tc>
+        <w:tc>
+          <w:tcPr>
+            <w:tcW w:w="3091" w:type="dxa"/>
+            <w:vAlign w:val="center"/>
+          </w:tcPr>
+          <w:p>
+            <w:pPr>
+              <w:pStyle w:val="ReportTable"/>
+            </w:pPr>
+            <w:r>
+              <w:rPr>
+                <w:sz w:val="18"/>
+              </w:rPr>
+              <w:t xml:space="preserve">Leonardo: modularización, pruebas, lint, revisión de dependencias y documentación</w:t>
+            </w:r>
+          </w:p>
+        </w:tc>
+        <w:tc>
+          <w:tcPr>
+            <w:tcW w:w="3091" w:type="dxa"/>
+            <w:vAlign w:val="center"/>
+          </w:tcPr>
+          <w:p>
+            <w:pPr>
+              <w:pStyle w:val="ReportTable"/>
+            </w:pPr>
+            <w:r>
+              <w:rPr>
+                <w:sz w:val="18"/>
+              </w:rPr>
+              <w:t xml:space="preserve">Módulos, pruebas y revisión de reproducibilidad; el ajuste del 1.01 surge de esa revisión</w:t>
+            </w:r>
+          </w:p>
+        </w:tc>
+      </w:tr>
+      <w:tr>
+        <w:trPr>
+          <w:cantSplit/>
+        </w:trPr>
+        <w:tc>
+          <w:tcPr>
+            <w:tcW w:w="1695" w:type="dxa"/>
+            <w:vAlign w:val="center"/>
+            <w:shd w:fill="F5F8FA"/>
+          </w:tcPr>
+          <w:p>
+            <w:pPr>
+              <w:pStyle w:val="ReportTable"/>
+            </w:pPr>
+            <w:r>
+              <w:rPr>
+                <w:sz w:val="18"/>
+              </w:rPr>
+              <w:t xml:space="preserve">ML Engineer</w:t>
+            </w:r>
+          </w:p>
+        </w:tc>
+        <w:tc>
+          <w:tcPr>
+            <w:tcW w:w="2094" w:type="dxa"/>
+            <w:vAlign w:val="center"/>
+            <w:shd w:fill="F5F8FA"/>
+          </w:tcPr>
+          <w:p>
+            <w:pPr>
+              <w:pStyle w:val="ReportTable"/>
+            </w:pPr>
+            <w:r>
+              <w:rPr>
+                <w:sz w:val="18"/>
+              </w:rPr>
+              <w:t xml:space="preserve">Dataset para modelado y versionado de datos</w:t>
+            </w:r>
+          </w:p>
+        </w:tc>
+        <w:tc>
+          <w:tcPr>
+            <w:tcW w:w="3091" w:type="dxa"/>
+            <w:vAlign w:val="center"/>
+            <w:shd w:fill="F5F8FA"/>
+          </w:tcPr>
+          <w:p>
+            <w:pPr>
+              <w:pStyle w:val="ReportTable"/>
+            </w:pPr>
+            <w:r>
+              <w:rPr>
+                <w:sz w:val="18"/>
+              </w:rPr>
+              <w:t xml:space="preserve">Leonardo: construcción de processed y registro de versiones de datasets</w:t>
+            </w:r>
+          </w:p>
+        </w:tc>
+        <w:tc>
+          <w:tcPr>
+            <w:tcW w:w="3091" w:type="dxa"/>
+            <w:vAlign w:val="center"/>
+            <w:shd w:fill="F5F8FA"/>
+          </w:tcPr>
+          <w:p>
+            <w:pPr>
+              <w:pStyle w:val="ReportTable"/>
+            </w:pPr>
+            <w:r>
+              <w:rPr>
+                <w:sz w:val="18"/>
+              </w:rPr>
+              <w:t xml:space="preserve">Convierte decisiones analíticas en parámetros, código y corridas auditables</w:t>
+            </w:r>
+          </w:p>
+        </w:tc>
+      </w:tr>
+      <w:tr>
+        <w:trPr>
+          <w:cantSplit/>
+        </w:trPr>
+        <w:tc>
+          <w:tcPr>
+            <w:tcW w:w="1695" w:type="dxa"/>
+            <w:vAlign w:val="center"/>
+          </w:tcPr>
+          <w:p>
+            <w:pPr>
+              <w:pStyle w:val="ReportTable"/>
+            </w:pPr>
+            <w:r>
+              <w:rPr>
+                <w:sz w:val="18"/>
+              </w:rPr>
+              <w:t xml:space="preserve">SRE / reproducibilidad</w:t>
+            </w:r>
+          </w:p>
+        </w:tc>
+        <w:tc>
+          <w:tcPr>
+            <w:tcW w:w="2094" w:type="dxa"/>
+            <w:vAlign w:val="center"/>
+          </w:tcPr>
+          <w:p>
+            <w:pPr>
+              <w:pStyle w:val="ReportTable"/>
+            </w:pPr>
+            <w:r>
+              <w:rPr>
+                <w:sz w:val="18"/>
+              </w:rPr>
+              <w:t xml:space="preserve">Ambiente y servicio de MLflow</w:t>
+            </w:r>
+          </w:p>
+        </w:tc>
+        <w:tc>
+          <w:tcPr>
+            <w:tcW w:w="3091" w:type="dxa"/>
+            <w:vAlign w:val="center"/>
+          </w:tcPr>
+          <w:p>
+            <w:pPr>
+              <w:pStyle w:val="ReportTable"/>
+            </w:pPr>
+            <w:r>
+              <w:rPr>
+                <w:sz w:val="18"/>
+              </w:rPr>
+              <w:t xml:space="preserve">Erik: incorporación de MLflow; José Eduardo: ajuste de dependencias y reproducción del resumen; Leonardo: ambiente y servidor local</w:t>
+            </w:r>
+          </w:p>
+        </w:tc>
+        <w:tc>
+          <w:tcPr>
+            <w:tcW w:w="3091" w:type="dxa"/>
+            <w:vAlign w:val="center"/>
+          </w:tcPr>
+          <w:p>
+            <w:pPr>
+              <w:pStyle w:val="ReportTable"/>
+            </w:pPr>
+            <w:r>
+              <w:rPr>
+                <w:sz w:val="18"/>
+              </w:rPr>
+              <w:t xml:space="preserve">Makefile, environment y PR de configuración; facilitan la ejecución común, sin infraestructura productiva desplegada</w:t>
+            </w:r>
+          </w:p>
+        </w:tc>
+      </w:tr>
+    </w:tbl>
+    <w:p>
+      <w:pPr>
+        <w:pStyle w:val="ReportBody"/>
+        <w:spacing w:before="0" w:after="20"/>
+      </w:pPr>
+    </w:p>
+    <w:p>
+      <w:pPr>
+        <w:pStyle w:val="ReportBody"/>
+      </w:pPr>
+      <w:r>
+        <w:rPr/>
+        <w:t xml:space="preserve">La interacción principal fue Data Engineer → Data Scientist → decisiones del equipo → integración e implementación por Software/ML Engineer. Los cuatro integrantes aportaron evidencia y participaron en las decisiones; la integración, documentación e implementación técnica estuvieron a cargo de Leonardo. Un ejemplo verificable es la revisión del notebook 1.01: se identificó una entrada sin generación documentada, el autor agregó la construcción y el integrador contrastó los resultados. Otro es el análisis de expansión, cuyo denominador mensual fue refinado por la integración sin atribuir ese contraste al autor del EDA original.</w:t>
+      </w:r>
+    </w:p>
+    <w:p>
+      <w:pPr>
+        <w:pStyle w:val="ReportH1"/>
+        <w:pageBreakBefore/>
+      </w:pPr>
+      <w:r>
+        <w:rPr/>
+        <w:t xml:space="preserve">10. Actividad en GitHub y contribuciones individuales</w:t>
+      </w:r>
+    </w:p>
+    <w:p>
+      <w:pPr>
+        <w:pStyle w:val="ReportBody"/>
+      </w:pPr>
+      <w:r>
+        <w:rPr/>
+        <w:t xml:space="preserve">El repositorio público </w:t>
+      </w:r>
+      <w:hyperlink r:id="rId41">
+        <w:r>
+          <w:rPr>
+            <w:color w:val="15658B"/>
+          </w:rPr>
+          <w:t xml:space="preserve">MiBici</w:t>
+        </w:r>
+      </w:hyperlink>
+      <w:r>
+        <w:rPr/>
+        <w:t xml:space="preserve"> contiene contribuciones identificables de los cuatro integrantes. Su </w:t>
+      </w:r>
+      <w:hyperlink r:id="rId42">
+        <w:r>
+          <w:rPr>
+            <w:color w:val="15658B"/>
+          </w:rPr>
+          <w:t xml:space="preserve">historial de la rama principal</w:t>
+        </w:r>
+      </w:hyperlink>
+      <w:r>
+        <w:rPr/>
+        <w:t xml:space="preserve"> conserva los commits de autor y las integraciones de los PR #1–#7. La evidencia vincula la preparación, el EDA y la integración con contribuciones individuales y una base de código compartida.</w:t>
       </w:r>
     </w:p>
     <w:tbl>
@@ -6614,7 +7628,7 @@
                 <w:b/>
                 <w:sz w:val="18"/>
               </w:rPr>
-              <w:t xml:space="preserve">Rol</w:t>
+              <w:t xml:space="preserve">Integrante</w:t>
             </w:r>
           </w:p>
         </w:tc>
@@ -6633,7 +7647,7 @@
                 <w:b/>
                 <w:sz w:val="18"/>
               </w:rPr>
-              <w:t xml:space="preserve">Responsables y actividades</w:t>
+              <w:t xml:space="preserve">Contribución verificable</w:t>
             </w:r>
           </w:p>
         </w:tc>
@@ -6652,7 +7666,7 @@
                 <w:b/>
                 <w:sz w:val="18"/>
               </w:rPr>
-              <w:t xml:space="preserve">Evidencia e interacción</w:t>
+              <w:t xml:space="preserve">PR o evidencia</w:t>
             </w:r>
           </w:p>
         </w:tc>
@@ -6674,7 +7688,7 @@
               <w:rPr>
                 <w:sz w:val="18"/>
               </w:rPr>
-              <w:t xml:space="preserve">Data Engineer</w:t>
+              <w:t xml:space="preserve">Erik Román Cortez</w:t>
             </w:r>
           </w:p>
         </w:tc>
@@ -6691,7 +7705,7 @@
               <w:rPr>
                 <w:sz w:val="18"/>
               </w:rPr>
-              <w:t xml:space="preserve">Leonardo: adquisición, perfilado, preparación, linaje y actividad de estaciones</w:t>
+              <w:t xml:space="preserve">Dependencia MLflow; EDA de estacionalidad y anomalías; lista de días atípicos</w:t>
             </w:r>
           </w:p>
         </w:tc>
@@ -6708,441 +7722,9 @@
               <w:rPr>
                 <w:sz w:val="18"/>
               </w:rPr>
-              <w:t xml:space="preserve">Entrega interim como insumo común al EDA; incorpora las reglas acordadas de calidad y exposición</w:t>
-            </w:r>
-          </w:p>
-        </w:tc>
-      </w:tr>
-      <w:tr>
-        <w:trPr>
-          <w:cantSplit/>
-        </w:trPr>
-        <w:tc>
-          <w:tcPr>
-            <w:tcW w:w="2293" w:type="dxa"/>
-            <w:vAlign w:val="center"/>
-            <w:shd w:fill="F5F8FA"/>
-          </w:tcPr>
-          <w:p>
-            <w:pPr>
-              <w:pStyle w:val="ReportTable"/>
-            </w:pPr>
-            <w:r>
-              <w:rPr>
-                <w:sz w:val="18"/>
-              </w:rPr>
-              <w:t xml:space="preserve">Data Scientist</w:t>
-            </w:r>
-          </w:p>
-        </w:tc>
-        <w:tc>
-          <w:tcPr>
-            <w:tcW w:w="3988" w:type="dxa"/>
-            <w:vAlign w:val="center"/>
-            <w:shd w:fill="F5F8FA"/>
-          </w:tcPr>
-          <w:p>
-            <w:pPr>
-              <w:pStyle w:val="ReportTable"/>
-            </w:pPr>
-            <w:r>
-              <w:rPr>
-                <w:sz w:val="18"/>
-              </w:rPr>
-              <w:t xml:space="preserve">José Eduardo: patrones temporales; Erik: estacionalidad y anomalías; José Emmanuel: expansión; Leonardo: integración del target</w:t>
-            </w:r>
-          </w:p>
-        </w:tc>
-        <w:tc>
-          <w:tcPr>
-            <w:tcW w:w="3689" w:type="dxa"/>
-            <w:vAlign w:val="center"/>
-            <w:shd w:fill="F5F8FA"/>
-          </w:tcPr>
-          <w:p>
-            <w:pPr>
-              <w:pStyle w:val="ReportTable"/>
-            </w:pPr>
-            <w:r>
-              <w:rPr>
-                <w:sz w:val="18"/>
-              </w:rPr>
-              <w:t xml:space="preserve">Notebooks 1.01–1.04; sus hallazgos alimentan las decisiones del procesamiento</w:t>
-            </w:r>
-          </w:p>
-        </w:tc>
-      </w:tr>
-      <w:tr>
-        <w:trPr>
-          <w:cantSplit/>
-        </w:trPr>
-        <w:tc>
-          <w:tcPr>
-            <w:tcW w:w="2293" w:type="dxa"/>
-            <w:vAlign w:val="center"/>
-          </w:tcPr>
-          <w:p>
-            <w:pPr>
-              <w:pStyle w:val="ReportTable"/>
-            </w:pPr>
-            <w:r>
-              <w:rPr>
-                <w:sz w:val="18"/>
-              </w:rPr>
-              <w:t xml:space="preserve">Software Engineer</w:t>
-            </w:r>
-          </w:p>
-        </w:tc>
-        <w:tc>
-          <w:tcPr>
-            <w:tcW w:w="3988" w:type="dxa"/>
-            <w:vAlign w:val="center"/>
-          </w:tcPr>
-          <w:p>
-            <w:pPr>
-              <w:pStyle w:val="ReportTable"/>
-            </w:pPr>
-            <w:r>
-              <w:rPr>
-                <w:sz w:val="18"/>
-              </w:rPr>
-              <w:t xml:space="preserve">Leonardo: modularización, pruebas, lint, revisión de dependencias y documentación</w:t>
-            </w:r>
-          </w:p>
-        </w:tc>
-        <w:tc>
-          <w:tcPr>
-            <w:tcW w:w="3689" w:type="dxa"/>
-            <w:vAlign w:val="center"/>
-          </w:tcPr>
-          <w:p>
-            <w:pPr>
-              <w:pStyle w:val="ReportTable"/>
-            </w:pPr>
-            <w:r>
-              <w:rPr>
-                <w:sz w:val="18"/>
-              </w:rPr>
-              <w:t xml:space="preserve">Módulos, pruebas y revisión de reproducibilidad; el ajuste del 1.01 surge de esa revisión</w:t>
-            </w:r>
-          </w:p>
-        </w:tc>
-      </w:tr>
-      <w:tr>
-        <w:trPr>
-          <w:cantSplit/>
-        </w:trPr>
-        <w:tc>
-          <w:tcPr>
-            <w:tcW w:w="2293" w:type="dxa"/>
-            <w:vAlign w:val="center"/>
-            <w:shd w:fill="F5F8FA"/>
-          </w:tcPr>
-          <w:p>
-            <w:pPr>
-              <w:pStyle w:val="ReportTable"/>
-            </w:pPr>
-            <w:r>
-              <w:rPr>
-                <w:sz w:val="18"/>
-              </w:rPr>
-              <w:t xml:space="preserve">ML Engineer</w:t>
-            </w:r>
-          </w:p>
-        </w:tc>
-        <w:tc>
-          <w:tcPr>
-            <w:tcW w:w="3988" w:type="dxa"/>
-            <w:vAlign w:val="center"/>
-            <w:shd w:fill="F5F8FA"/>
-          </w:tcPr>
-          <w:p>
-            <w:pPr>
-              <w:pStyle w:val="ReportTable"/>
-            </w:pPr>
-            <w:r>
-              <w:rPr>
-                <w:sz w:val="18"/>
-              </w:rPr>
-              <w:t xml:space="preserve">Leonardo: construcción de processed y registro de versiones de datasets</w:t>
-            </w:r>
-          </w:p>
-        </w:tc>
-        <w:tc>
-          <w:tcPr>
-            <w:tcW w:w="3689" w:type="dxa"/>
-            <w:vAlign w:val="center"/>
-            <w:shd w:fill="F5F8FA"/>
-          </w:tcPr>
-          <w:p>
-            <w:pPr>
-              <w:pStyle w:val="ReportTable"/>
-            </w:pPr>
-            <w:r>
-              <w:rPr>
-                <w:sz w:val="18"/>
-              </w:rPr>
-              <w:t xml:space="preserve">Convierte decisiones analíticas en parámetros, código y corridas auditables</w:t>
-            </w:r>
-          </w:p>
-        </w:tc>
-      </w:tr>
-      <w:tr>
-        <w:trPr>
-          <w:cantSplit/>
-        </w:trPr>
-        <w:tc>
-          <w:tcPr>
-            <w:tcW w:w="2293" w:type="dxa"/>
-            <w:vAlign w:val="center"/>
-          </w:tcPr>
-          <w:p>
-            <w:pPr>
-              <w:pStyle w:val="ReportTable"/>
-            </w:pPr>
-            <w:r>
-              <w:rPr>
-                <w:sz w:val="18"/>
-              </w:rPr>
-              <w:t xml:space="preserve">SRE / reproducibilidad</w:t>
-            </w:r>
-          </w:p>
-        </w:tc>
-        <w:tc>
-          <w:tcPr>
-            <w:tcW w:w="3988" w:type="dxa"/>
-            <w:vAlign w:val="center"/>
-          </w:tcPr>
-          <w:p>
-            <w:pPr>
-              <w:pStyle w:val="ReportTable"/>
-            </w:pPr>
-            <w:r>
-              <w:rPr>
-                <w:sz w:val="18"/>
-              </w:rPr>
-              <w:t xml:space="preserve">Erik: incorporación de MLflow; José Eduardo: ajuste de dependencias y reproducción del resumen; Leonardo: ambiente y servidor local</w:t>
-            </w:r>
-          </w:p>
-        </w:tc>
-        <w:tc>
-          <w:tcPr>
-            <w:tcW w:w="3689" w:type="dxa"/>
-            <w:vAlign w:val="center"/>
-          </w:tcPr>
-          <w:p>
-            <w:pPr>
-              <w:pStyle w:val="ReportTable"/>
-            </w:pPr>
-            <w:r>
-              <w:rPr>
-                <w:sz w:val="18"/>
-              </w:rPr>
-              <w:t xml:space="preserve">Makefile, environment y PR de configuración; facilitan la ejecución común, sin infraestructura productiva desplegada</w:t>
-            </w:r>
-          </w:p>
-        </w:tc>
-      </w:tr>
-    </w:tbl>
-    <w:p>
-      <w:pPr>
-        <w:pStyle w:val="ReportBody"/>
-        <w:spacing w:before="0" w:after="20"/>
-      </w:pPr>
-    </w:p>
-    <w:p>
-      <w:pPr>
-        <w:pStyle w:val="ReportBody"/>
-      </w:pPr>
-      <w:r>
-        <w:rPr/>
-        <w:t xml:space="preserve">La interacción principal fue Data Engineer → Data Scientist → decisiones del equipo → integración e implementación por Software/ML Engineer. Los cuatro integrantes aportaron evidencia y participaron en las decisiones; la integración, documentación e implementación técnica estuvieron a cargo de Leonardo. Un ejemplo verificable es la revisión del notebook 1.01: se identificó una entrada sin generación documentada, el autor agregó la construcción y el integrador contrastó los resultados. Otro es el análisis de expansión, cuyo denominador mensual fue refinado por la integración sin atribuir ese contraste al autor del EDA original.</w:t>
-      </w:r>
-    </w:p>
-    <w:p>
-      <w:pPr>
-        <w:pStyle w:val="ReportH1"/>
-        <w:pageBreakBefore/>
-      </w:pPr>
-      <w:r>
-        <w:rPr/>
-        <w:t xml:space="preserve">10. Actividad en GitHub y contribuciones individuales</w:t>
-      </w:r>
-    </w:p>
-    <w:p>
-      <w:pPr>
-        <w:pStyle w:val="ReportBody"/>
-      </w:pPr>
-      <w:r>
-        <w:rPr/>
-        <w:t xml:space="preserve">El repositorio público </w:t>
-      </w:r>
-      <w:hyperlink r:id="rId40">
-        <w:r>
-          <w:rPr>
-            <w:color w:val="15658B"/>
-          </w:rPr>
-          <w:t xml:space="preserve">MiBici</w:t>
-        </w:r>
-      </w:hyperlink>
-      <w:r>
-        <w:rPr/>
-        <w:t xml:space="preserve"> contiene contribuciones identificables de los cuatro integrantes. Su </w:t>
-      </w:r>
-      <w:hyperlink r:id="rId41">
-        <w:r>
-          <w:rPr>
-            <w:color w:val="15658B"/>
-          </w:rPr>
-          <w:t xml:space="preserve">historial de la rama principal</w:t>
-        </w:r>
-      </w:hyperlink>
-      <w:r>
-        <w:rPr/>
-        <w:t xml:space="preserve"> conserva los commits de autor y las integraciones de los PR #1–#7. La evidencia vincula la preparación, el EDA y la integración con contribuciones individuales y una base de código compartida.</w:t>
-      </w:r>
-    </w:p>
-    <w:tbl>
-      <w:tblPr>
-        <w:tblW w:w="9972" w:type="dxa"/>
-        <w:tblLayout w:type="fixed"/>
-        <w:tblCellMar>
-          <w:top w:w="85" w:type="dxa"/>
-          <w:left w:w="85" w:type="dxa"/>
-          <w:bottom w:w="85" w:type="dxa"/>
-          <w:right w:w="85" w:type="dxa"/>
-        </w:tblCellMar>
-        <w:tblBorders>
-          <w:top w:val="single" w:sz="4" w:color="D5DFE6"/>
-          <w:left w:val="single" w:sz="4" w:color="D5DFE6"/>
-          <w:bottom w:val="single" w:sz="4" w:color="D5DFE6"/>
-          <w:right w:val="single" w:sz="4" w:color="D5DFE6"/>
-          <w:insideH w:val="single" w:sz="4" w:color="D5DFE6"/>
-          <w:insideV w:val="single" w:sz="4" w:color="D5DFE6"/>
-        </w:tblBorders>
-      </w:tblPr>
-      <w:tblGrid>
-        <w:gridCol w:w="2293"/>
-        <w:gridCol w:w="3988"/>
-        <w:gridCol w:w="3689"/>
-      </w:tblGrid>
-      <w:tr>
-        <w:trPr>
-          <w:cantSplit/>
-          <w:tblHeader/>
-        </w:trPr>
-        <w:tc>
-          <w:tcPr>
-            <w:tcW w:w="2293" w:type="dxa"/>
-            <w:vAlign w:val="center"/>
-            <w:shd w:fill="E3EDF4"/>
-          </w:tcPr>
-          <w:p>
-            <w:pPr>
-              <w:pStyle w:val="ReportTable"/>
-            </w:pPr>
-            <w:r>
-              <w:rPr>
-                <w:b/>
-                <w:sz w:val="18"/>
-              </w:rPr>
-              <w:t xml:space="preserve">Integrante</w:t>
-            </w:r>
-          </w:p>
-        </w:tc>
-        <w:tc>
-          <w:tcPr>
-            <w:tcW w:w="3988" w:type="dxa"/>
-            <w:vAlign w:val="center"/>
-            <w:shd w:fill="E3EDF4"/>
-          </w:tcPr>
-          <w:p>
-            <w:pPr>
-              <w:pStyle w:val="ReportTable"/>
-            </w:pPr>
-            <w:r>
-              <w:rPr>
-                <w:b/>
-                <w:sz w:val="18"/>
-              </w:rPr>
-              <w:t xml:space="preserve">Contribución verificable</w:t>
-            </w:r>
-          </w:p>
-        </w:tc>
-        <w:tc>
-          <w:tcPr>
-            <w:tcW w:w="3689" w:type="dxa"/>
-            <w:vAlign w:val="center"/>
-            <w:shd w:fill="E3EDF4"/>
-          </w:tcPr>
-          <w:p>
-            <w:pPr>
-              <w:pStyle w:val="ReportTable"/>
-            </w:pPr>
-            <w:r>
-              <w:rPr>
-                <w:b/>
-                <w:sz w:val="18"/>
-              </w:rPr>
-              <w:t xml:space="preserve">PR o evidencia</w:t>
-            </w:r>
-          </w:p>
-        </w:tc>
-      </w:tr>
-      <w:tr>
-        <w:trPr>
-          <w:cantSplit/>
-        </w:trPr>
-        <w:tc>
-          <w:tcPr>
-            <w:tcW w:w="2293" w:type="dxa"/>
-            <w:vAlign w:val="center"/>
-          </w:tcPr>
-          <w:p>
-            <w:pPr>
-              <w:pStyle w:val="ReportTable"/>
-            </w:pPr>
-            <w:r>
-              <w:rPr>
-                <w:sz w:val="18"/>
-              </w:rPr>
-              <w:t xml:space="preserve">Erik Román Cortez</w:t>
-            </w:r>
-          </w:p>
-        </w:tc>
-        <w:tc>
-          <w:tcPr>
-            <w:tcW w:w="3988" w:type="dxa"/>
-            <w:vAlign w:val="center"/>
-          </w:tcPr>
-          <w:p>
-            <w:pPr>
-              <w:pStyle w:val="ReportTable"/>
-            </w:pPr>
-            <w:r>
-              <w:rPr>
-                <w:sz w:val="18"/>
-              </w:rPr>
-              <w:t xml:space="preserve">Dependencia MLflow; EDA de estacionalidad y anomalías; lista de días atípicos</w:t>
-            </w:r>
-          </w:p>
-        </w:tc>
-        <w:tc>
-          <w:tcPr>
-            <w:tcW w:w="3689" w:type="dxa"/>
-            <w:vAlign w:val="center"/>
-          </w:tcPr>
-          <w:p>
-            <w:pPr>
-              <w:pStyle w:val="ReportTable"/>
-            </w:pPr>
-            <w:r>
-              <w:rPr>
-                <w:sz w:val="18"/>
-              </w:rPr>
               <w:t xml:space="preserve">PR #1 y </w:t>
             </w:r>
-            <w:hyperlink r:id="rId42">
+            <w:hyperlink r:id="rId43">
               <w:r>
                 <w:rPr>
                   <w:sz w:val="18"/>
@@ -7210,7 +7792,7 @@
             <w:pPr>
               <w:pStyle w:val="ReportTable"/>
             </w:pPr>
-            <w:hyperlink r:id="rId43">
+            <w:hyperlink r:id="rId44">
               <w:r>
                 <w:rPr>
                   <w:sz w:val="18"/>
@@ -7275,7 +7857,7 @@
             <w:pPr>
               <w:pStyle w:val="ReportTable"/>
             </w:pPr>
-            <w:hyperlink r:id="rId44">
+            <w:hyperlink r:id="rId45">
               <w:r>
                 <w:rPr>
                   <w:sz w:val="18"/>
@@ -7290,7 +7872,7 @@
               </w:rPr>
               <w:t xml:space="preserve"> y </w:t>
             </w:r>
-            <w:hyperlink r:id="rId45">
+            <w:hyperlink r:id="rId46">
               <w:r>
                 <w:rPr>
                   <w:sz w:val="18"/>
@@ -7358,7 +7940,7 @@
             <w:pPr>
               <w:pStyle w:val="ReportTable"/>
             </w:pPr>
-            <w:hyperlink r:id="rId46">
+            <w:hyperlink r:id="rId47">
               <w:r>
                 <w:rPr>
                   <w:sz w:val="18"/>
@@ -7373,7 +7955,7 @@
               </w:rPr>
               <w:t xml:space="preserve"> y </w:t>
             </w:r>
-            <w:hyperlink r:id="rId47">
+            <w:hyperlink r:id="rId48">
               <w:r>
                 <w:rPr>
                   <w:sz w:val="18"/>
@@ -7415,7 +7997,7 @@
         <w:rPr/>
         <w:t xml:space="preserve">El </w:t>
       </w:r>
-      <w:hyperlink r:id="rId48">
+      <w:hyperlink r:id="rId49">
         <w:r>
           <w:rPr>
             <w:color w:val="15658B"/>
@@ -8051,463 +8633,36 @@
         <w:t xml:space="preserve">El equipo utilizó herramientas de inteligencia artificial como apoyo a la generación de código, depuración, análisis y documentación. Las decisiones de negocio y preprocesamiento, la interpretación de resultados y la responsabilidad académica corresponden a los integrantes. La siguiente tabla identifica las herramientas, modelos y finalidades declarados para cada contribución.</w:t>
       </w:r>
     </w:p>
-    <w:tbl>
-      <w:tblPr>
-        <w:tblW w:w="9972" w:type="dxa"/>
-        <w:tblLayout w:type="fixed"/>
-        <w:tblCellMar>
-          <w:top w:w="85" w:type="dxa"/>
-          <w:left w:w="85" w:type="dxa"/>
-          <w:bottom w:w="85" w:type="dxa"/>
-          <w:right w:w="85" w:type="dxa"/>
-        </w:tblCellMar>
-        <w:tblBorders>
-          <w:top w:val="single" w:sz="4" w:color="D5DFE6"/>
-          <w:left w:val="single" w:sz="4" w:color="D5DFE6"/>
-          <w:bottom w:val="single" w:sz="4" w:color="D5DFE6"/>
-          <w:right w:val="single" w:sz="4" w:color="D5DFE6"/>
-          <w:insideH w:val="single" w:sz="4" w:color="D5DFE6"/>
-          <w:insideV w:val="single" w:sz="4" w:color="D5DFE6"/>
-        </w:tblBorders>
-      </w:tblPr>
-      <w:tblGrid>
-        <w:gridCol w:w="2293"/>
-        <w:gridCol w:w="3988"/>
-        <w:gridCol w:w="3689"/>
-      </w:tblGrid>
-      <w:tr>
-        <w:trPr>
-          <w:cantSplit/>
-          <w:tblHeader/>
-        </w:trPr>
-        <w:tc>
-          <w:tcPr>
-            <w:tcW w:w="2293" w:type="dxa"/>
-            <w:vAlign w:val="center"/>
-            <w:shd w:fill="E3EDF4"/>
-          </w:tcPr>
-          <w:p>
-            <w:pPr>
-              <w:pStyle w:val="ReportTable"/>
-            </w:pPr>
-            <w:r>
-              <w:rPr>
-                <w:b/>
-                <w:sz w:val="18"/>
-              </w:rPr>
-              <w:t xml:space="preserve">Integrante</w:t>
-            </w:r>
-          </w:p>
-        </w:tc>
-        <w:tc>
-          <w:tcPr>
-            <w:tcW w:w="3988" w:type="dxa"/>
-            <w:vAlign w:val="center"/>
-            <w:shd w:fill="E3EDF4"/>
-          </w:tcPr>
-          <w:p>
-            <w:pPr>
-              <w:pStyle w:val="ReportTable"/>
-            </w:pPr>
-            <w:r>
-              <w:rPr>
-                <w:b/>
-                <w:sz w:val="18"/>
-              </w:rPr>
-              <w:t xml:space="preserve">Herramienta y modelo</w:t>
-            </w:r>
-          </w:p>
-        </w:tc>
-        <w:tc>
-          <w:tcPr>
-            <w:tcW w:w="3689" w:type="dxa"/>
-            <w:vAlign w:val="center"/>
-            <w:shd w:fill="E3EDF4"/>
-          </w:tcPr>
-          <w:p>
-            <w:pPr>
-              <w:pStyle w:val="ReportTable"/>
-            </w:pPr>
-            <w:r>
-              <w:rPr>
-                <w:b/>
-                <w:sz w:val="18"/>
-              </w:rPr>
-              <w:t xml:space="preserve">Finalidad</w:t>
-            </w:r>
-          </w:p>
-        </w:tc>
-      </w:tr>
-      <w:tr>
-        <w:trPr>
-          <w:cantSplit/>
-        </w:trPr>
-        <w:tc>
-          <w:tcPr>
-            <w:tcW w:w="2293" w:type="dxa"/>
-            <w:vAlign w:val="center"/>
-          </w:tcPr>
-          <w:p>
-            <w:pPr>
-              <w:pStyle w:val="ReportTable"/>
-            </w:pPr>
-            <w:r>
-              <w:rPr>
-                <w:sz w:val="18"/>
-              </w:rPr>
-              <w:t xml:space="preserve">José Eduardo De Moraes López</w:t>
-            </w:r>
-          </w:p>
-        </w:tc>
-        <w:tc>
-          <w:tcPr>
-            <w:tcW w:w="3988" w:type="dxa"/>
-            <w:vAlign w:val="center"/>
-          </w:tcPr>
-          <w:p>
-            <w:pPr>
-              <w:pStyle w:val="ReportTable"/>
-            </w:pPr>
-            <w:r>
-              <w:rPr>
-                <w:sz w:val="18"/>
-              </w:rPr>
-              <w:t xml:space="preserve">Gemini, Google</w:t>
-            </w:r>
-          </w:p>
-        </w:tc>
-        <w:tc>
-          <w:tcPr>
-            <w:tcW w:w="3689" w:type="dxa"/>
-            <w:vAlign w:val="center"/>
-          </w:tcPr>
-          <w:p>
-            <w:pPr>
-              <w:pStyle w:val="ReportTable"/>
-            </w:pPr>
-            <w:r>
-              <w:rPr>
-                <w:sz w:val="18"/>
-              </w:rPr>
-              <w:t xml:space="preserve">Apoyo a la carga y agregación por bloques anuales del notebook 1.01, parametrización de gráficas y estructuración de su análisis escrito</w:t>
-            </w:r>
-          </w:p>
-        </w:tc>
-      </w:tr>
-      <w:tr>
-        <w:trPr>
-          <w:cantSplit/>
-        </w:trPr>
-        <w:tc>
-          <w:tcPr>
-            <w:tcW w:w="2293" w:type="dxa"/>
-            <w:vAlign w:val="center"/>
-            <w:shd w:fill="F5F8FA"/>
-          </w:tcPr>
-          <w:p>
-            <w:pPr>
-              <w:pStyle w:val="ReportTable"/>
-            </w:pPr>
-            <w:r>
-              <w:rPr>
-                <w:sz w:val="18"/>
-              </w:rPr>
-              <w:t xml:space="preserve">Erik Román Cortez</w:t>
-            </w:r>
-          </w:p>
-        </w:tc>
-        <w:tc>
-          <w:tcPr>
-            <w:tcW w:w="3988" w:type="dxa"/>
-            <w:vAlign w:val="center"/>
-            <w:shd w:fill="F5F8FA"/>
-          </w:tcPr>
-          <w:p>
-            <w:pPr>
-              <w:pStyle w:val="ReportTable"/>
-            </w:pPr>
-            <w:r>
-              <w:rPr>
-                <w:sz w:val="18"/>
-              </w:rPr>
-              <w:t xml:space="preserve">Claude, Anthropic, modelo Opus</w:t>
-            </w:r>
-          </w:p>
-        </w:tc>
-        <w:tc>
-          <w:tcPr>
-            <w:tcW w:w="3689" w:type="dxa"/>
-            <w:vAlign w:val="center"/>
-            <w:shd w:fill="F5F8FA"/>
-          </w:tcPr>
-          <w:p>
-            <w:pPr>
-              <w:pStyle w:val="ReportTable"/>
-            </w:pPr>
-            <w:r>
-              <w:rPr>
-                <w:sz w:val="18"/>
-              </w:rPr>
-              <w:t xml:space="preserve">Apoyo en la elaboración del código del notebook 1.02</w:t>
-            </w:r>
-          </w:p>
-        </w:tc>
-      </w:tr>
-      <w:tr>
-        <w:trPr>
-          <w:cantSplit/>
-        </w:trPr>
-        <w:tc>
-          <w:tcPr>
-            <w:tcW w:w="2293" w:type="dxa"/>
-            <w:vAlign w:val="center"/>
-          </w:tcPr>
-          <w:p>
-            <w:pPr>
-              <w:pStyle w:val="ReportTable"/>
-            </w:pPr>
-            <w:r>
-              <w:rPr>
-                <w:sz w:val="18"/>
-              </w:rPr>
-              <w:t xml:space="preserve">José Emmanuel Vázquez Galán</w:t>
-            </w:r>
-          </w:p>
-        </w:tc>
-        <w:tc>
-          <w:tcPr>
-            <w:tcW w:w="3988" w:type="dxa"/>
-            <w:vAlign w:val="center"/>
-          </w:tcPr>
-          <w:p>
-            <w:pPr>
-              <w:pStyle w:val="ReportTable"/>
-            </w:pPr>
-            <w:r>
-              <w:rPr>
-                <w:sz w:val="18"/>
-              </w:rPr>
-              <w:t xml:space="preserve">ChatGPT, OpenAI, modelo GPT-6</w:t>
-            </w:r>
-          </w:p>
-        </w:tc>
-        <w:tc>
-          <w:tcPr>
-            <w:tcW w:w="3689" w:type="dxa"/>
-            <w:vAlign w:val="center"/>
-          </w:tcPr>
-          <w:p>
-            <w:pPr>
-              <w:pStyle w:val="ReportTable"/>
-            </w:pPr>
-            <w:r>
-              <w:rPr>
-                <w:sz w:val="18"/>
-              </w:rPr>
-              <w:t xml:space="preserve">Apoyo en código y documentación del notebook 1.03</w:t>
-            </w:r>
-          </w:p>
-        </w:tc>
-      </w:tr>
-      <w:tr>
-        <w:trPr>
-          <w:cantSplit/>
-        </w:trPr>
-        <w:tc>
-          <w:tcPr>
-            <w:tcW w:w="2293" w:type="dxa"/>
-            <w:vAlign w:val="center"/>
-            <w:shd w:fill="F5F8FA"/>
-          </w:tcPr>
-          <w:p>
-            <w:pPr>
-              <w:pStyle w:val="ReportTable"/>
-            </w:pPr>
-            <w:r>
-              <w:rPr>
-                <w:sz w:val="18"/>
-              </w:rPr>
-              <w:t xml:space="preserve">Leonardo Santos García</w:t>
-            </w:r>
-          </w:p>
-        </w:tc>
-        <w:tc>
-          <w:tcPr>
-            <w:tcW w:w="3988" w:type="dxa"/>
-            <w:vAlign w:val="center"/>
-            <w:shd w:fill="F5F8FA"/>
-          </w:tcPr>
-          <w:p>
-            <w:pPr>
-              <w:pStyle w:val="ReportTable"/>
-            </w:pPr>
-            <w:r>
-              <w:rPr>
-                <w:sz w:val="18"/>
-              </w:rPr>
-              <w:t xml:space="preserve">Claude Code, Anthropic, modelo Claude Opus 5.5</w:t>
-            </w:r>
-          </w:p>
-        </w:tc>
-        <w:tc>
-          <w:tcPr>
-            <w:tcW w:w="3689" w:type="dxa"/>
-            <w:vAlign w:val="center"/>
-            <w:shd w:fill="F5F8FA"/>
-          </w:tcPr>
-          <w:p>
-            <w:pPr>
-              <w:pStyle w:val="ReportTable"/>
-            </w:pPr>
-            <w:r>
-              <w:rPr>
-                <w:sz w:val="18"/>
-              </w:rPr>
-              <w:t xml:space="preserve">Generación de código, depuración, verificación de resultados y redacción preliminar de la preparación e integración</w:t>
-            </w:r>
-          </w:p>
-        </w:tc>
-      </w:tr>
-      <w:tr>
-        <w:trPr>
-          <w:cantSplit/>
-        </w:trPr>
-        <w:tc>
-          <w:tcPr>
-            <w:tcW w:w="2293" w:type="dxa"/>
-            <w:vAlign w:val="center"/>
-          </w:tcPr>
-          <w:p>
-            <w:pPr>
-              <w:pStyle w:val="ReportTable"/>
-            </w:pPr>
-            <w:r>
-              <w:rPr>
-                <w:sz w:val="18"/>
-              </w:rPr>
-              <w:t xml:space="preserve">Leonardo Santos García</w:t>
-            </w:r>
-          </w:p>
-        </w:tc>
-        <w:tc>
-          <w:tcPr>
-            <w:tcW w:w="3988" w:type="dxa"/>
-            <w:vAlign w:val="center"/>
-          </w:tcPr>
-          <w:p>
-            <w:pPr>
-              <w:pStyle w:val="ReportTable"/>
-            </w:pPr>
-            <w:r>
-              <w:rPr>
-                <w:sz w:val="18"/>
-              </w:rPr>
-              <w:t xml:space="preserve">ChatGPT, OpenAI, modelo GPT Sol 5.6</w:t>
-            </w:r>
-          </w:p>
-        </w:tc>
-        <w:tc>
-          <w:tcPr>
-            <w:tcW w:w="3689" w:type="dxa"/>
-            <w:vAlign w:val="center"/>
-          </w:tcPr>
-          <w:p>
-            <w:pPr>
-              <w:pStyle w:val="ReportTable"/>
-            </w:pPr>
-            <w:r>
-              <w:rPr>
-                <w:sz w:val="18"/>
-              </w:rPr>
-              <w:t xml:space="preserve">Planeación y revisión de la estrategia del pipeline</w:t>
-            </w:r>
-          </w:p>
-        </w:tc>
-      </w:tr>
-      <w:tr>
-        <w:trPr>
-          <w:cantSplit/>
-        </w:trPr>
-        <w:tc>
-          <w:tcPr>
-            <w:tcW w:w="2293" w:type="dxa"/>
-            <w:vAlign w:val="center"/>
-            <w:shd w:fill="F5F8FA"/>
-          </w:tcPr>
-          <w:p>
-            <w:pPr>
-              <w:pStyle w:val="ReportTable"/>
-            </w:pPr>
-            <w:r>
-              <w:rPr>
-                <w:sz w:val="18"/>
-              </w:rPr>
-              <w:t xml:space="preserve">Leonardo Santos García</w:t>
-            </w:r>
-          </w:p>
-        </w:tc>
-        <w:tc>
-          <w:tcPr>
-            <w:tcW w:w="3988" w:type="dxa"/>
-            <w:vAlign w:val="center"/>
-            <w:shd w:fill="F5F8FA"/>
-          </w:tcPr>
-          <w:p>
-            <w:pPr>
-              <w:pStyle w:val="ReportTable"/>
-            </w:pPr>
-            <w:r>
-              <w:rPr>
-                <w:sz w:val="18"/>
-              </w:rPr>
-              <w:t xml:space="preserve">Codex, OpenAI, basado en GPT-6</w:t>
-            </w:r>
-          </w:p>
-        </w:tc>
-        <w:tc>
-          <w:tcPr>
-            <w:tcW w:w="3689" w:type="dxa"/>
-            <w:vAlign w:val="center"/>
-            <w:shd w:fill="F5F8FA"/>
-          </w:tcPr>
-          <w:p>
-            <w:pPr>
-              <w:pStyle w:val="ReportTable"/>
-            </w:pPr>
-            <w:r>
-              <w:rPr>
-                <w:sz w:val="18"/>
-              </w:rPr>
-              <w:t xml:space="preserve">Apoyo en consulta de fuentes del proyecto, verificación de cifras, revisión técnica y redacción del reporte</w:t>
-            </w:r>
-          </w:p>
-        </w:tc>
-      </w:tr>
-    </w:tbl>
-    <w:p>
-      <w:pPr>
-        <w:pStyle w:val="ReportBody"/>
-        <w:spacing w:before="0" w:after="20"/>
-      </w:pPr>
-    </w:p>
-    <w:p>
-      <w:pPr>
-        <w:pStyle w:val="ReportBody"/>
-      </w:pPr>
-      <w:r>
-        <w:rPr/>
-        <w:t xml:space="preserve">El contenido generado para el notebook 1.04 y su código asociado fue revisado, ejecutado y validado por el integrador, Leonardo Santos García. Las decisiones son del Equipo 04 y el equipo asume la responsabilidad final de lo entregado. La IA se utiliza como apoyo al trabajo de los integrantes y no sustituye la validación técnica ni la responsabilidad sobre los resultados.</w:t>
-      </w:r>
-    </w:p>
-    <w:p>
-      <w:pPr>
-        <w:pStyle w:val="ReportBody"/>
-      </w:pPr>
-      <w:r>
-        <w:rPr/>
-        <w:t xml:space="preserve">Referencias de las herramientas: </w:t>
-      </w:r>
-      <w:hyperlink r:id="rId49">
+    <w:p>
+      <w:pPr>
+        <w:pStyle w:val="ReportBody"/>
+        <w:ind w:left="230" w:hanging="230"/>
+      </w:pPr>
+      <w:r>
+        <w:rPr/>
+        <w:t xml:space="preserve">• </w:t>
+      </w:r>
+      <w:r>
+        <w:rPr>
+          <w:b/>
+        </w:rPr>
+        <w:t xml:space="preserve">Declarado por José Eduardo De Moraes López:</w:t>
+      </w:r>
+      <w:r>
+        <w:rPr/>
+        <w:t xml:space="preserve"> Google. (2026). </w:t>
+      </w:r>
+      <w:r>
+        <w:rPr>
+          <w:i/>
+        </w:rPr>
+        <w:t xml:space="preserve">Gemini (Gemini 1.5 Pro / Flash)</w:t>
+      </w:r>
+      <w:r>
+        <w:rPr/>
+        <w:t xml:space="preserve"> [Modelo de lenguaje grande], utilizado para generación de código del notebook 1.01 (carga y agregación por bloques anuales, parametrización de gráficas) y estructuración de su análisis escrito. </w:t>
+      </w:r>
+      <w:hyperlink r:id="rId50">
         <w:r>
           <w:rPr>
             <w:color w:val="15658B"/>
@@ -8517,9 +8672,123 @@
       </w:hyperlink>
       <w:r>
         <w:rPr/>
-        <w:t xml:space="preserve">, </w:t>
-      </w:r>
-      <w:hyperlink r:id="rId50">
+        <w:t xml:space="preserve">.</w:t>
+      </w:r>
+    </w:p>
+    <w:p>
+      <w:pPr>
+        <w:pStyle w:val="ReportBody"/>
+        <w:ind w:left="230" w:hanging="230"/>
+      </w:pPr>
+      <w:r>
+        <w:rPr/>
+        <w:t xml:space="preserve">• </w:t>
+      </w:r>
+      <w:r>
+        <w:rPr>
+          <w:b/>
+        </w:rPr>
+        <w:t xml:space="preserve">Declarado por Erik Román Cortez:</w:t>
+      </w:r>
+      <w:r>
+        <w:rPr/>
+        <w:t xml:space="preserve"> Anthropic. (2026). </w:t>
+      </w:r>
+      <w:r>
+        <w:rPr>
+          <w:i/>
+        </w:rPr>
+        <w:t xml:space="preserve">Claude (modelo Opus)</w:t>
+      </w:r>
+      <w:r>
+        <w:rPr/>
+        <w:t xml:space="preserve"> [Modelo de lenguaje grande], utilizado para generación de código del notebook 1.02. </w:t>
+      </w:r>
+      <w:hyperlink r:id="rId51">
+        <w:r>
+          <w:rPr>
+            <w:color w:val="15658B"/>
+          </w:rPr>
+          <w:t xml:space="preserve">Claude</w:t>
+        </w:r>
+      </w:hyperlink>
+      <w:r>
+        <w:rPr/>
+        <w:t xml:space="preserve">.</w:t>
+      </w:r>
+    </w:p>
+    <w:p>
+      <w:pPr>
+        <w:pStyle w:val="ReportBody"/>
+        <w:ind w:left="230" w:hanging="230"/>
+      </w:pPr>
+      <w:r>
+        <w:rPr/>
+        <w:t xml:space="preserve">• </w:t>
+      </w:r>
+      <w:r>
+        <w:rPr>
+          <w:b/>
+        </w:rPr>
+        <w:t xml:space="preserve">Declarado por José Emmanuel Vázquez Galán:</w:t>
+      </w:r>
+      <w:r>
+        <w:rPr/>
+        <w:t xml:space="preserve"> OpenAI. (2026). </w:t>
+      </w:r>
+      <w:r>
+        <w:rPr>
+          <w:i/>
+        </w:rPr>
+        <w:t xml:space="preserve">ChatGPT (GPT-6)</w:t>
+      </w:r>
+      <w:r>
+        <w:rPr/>
+        <w:t xml:space="preserve"> [Modelo de lenguaje grande], utilizado para generación de código y documentación del notebook 1.03. </w:t>
+      </w:r>
+      <w:hyperlink r:id="rId52">
+        <w:r>
+          <w:rPr>
+            <w:color w:val="15658B"/>
+          </w:rPr>
+          <w:t xml:space="preserve">ChatGPT</w:t>
+        </w:r>
+      </w:hyperlink>
+      <w:r>
+        <w:rPr/>
+        <w:t xml:space="preserve">.</w:t>
+      </w:r>
+    </w:p>
+    <w:p>
+      <w:pPr>
+        <w:pStyle w:val="ReportBody"/>
+        <w:ind w:left="230" w:hanging="230"/>
+      </w:pPr>
+      <w:r>
+        <w:rPr/>
+        <w:t xml:space="preserve">• </w:t>
+      </w:r>
+      <w:r>
+        <w:rPr>
+          <w:b/>
+        </w:rPr>
+        <w:t xml:space="preserve">Declarado por Leonardo Santos García:</w:t>
+      </w:r>
+      <w:r>
+        <w:rPr/>
+        <w:t xml:space="preserve"> Anthropic. (2026). </w:t>
+      </w:r>
+      <w:r>
+        <w:rPr>
+          <w:i/>
+        </w:rPr>
+        <w:t xml:space="preserve">Claude Code (Claude Opus 5.5)</w:t>
+      </w:r>
+      <w:r>
+        <w:rPr/>
+        <w:t xml:space="preserve"> [Modelo de lenguaje grande], utilizado para generación de código, depuración, verificación de resultados y redacción preliminar de la preparación e integración. </w:t>
+      </w:r>
+      <w:hyperlink r:id="rId53">
         <w:r>
           <w:rPr>
             <w:color w:val="15658B"/>
@@ -8529,9 +8798,39 @@
       </w:hyperlink>
       <w:r>
         <w:rPr/>
-        <w:t xml:space="preserve">, </w:t>
-      </w:r>
-      <w:hyperlink r:id="rId51">
+        <w:t xml:space="preserve">.</w:t>
+      </w:r>
+    </w:p>
+    <w:p>
+      <w:pPr>
+        <w:pStyle w:val="ReportBody"/>
+        <w:ind w:left="230" w:hanging="230"/>
+      </w:pPr>
+      <w:r>
+        <w:rPr/>
+        <w:t xml:space="preserve">• </w:t>
+      </w:r>
+      <w:r>
+        <w:rPr>
+          <w:b/>
+        </w:rPr>
+        <w:t xml:space="preserve">Declarado por Leonardo Santos García:</w:t>
+      </w:r>
+      <w:r>
+        <w:rPr/>
+        <w:t xml:space="preserve"> OpenAI. (2026). </w:t>
+      </w:r>
+      <w:r>
+        <w:rPr>
+          <w:i/>
+        </w:rPr>
+        <w:t xml:space="preserve">ChatGPT (GPT Sol 5.6)</w:t>
+      </w:r>
+      <w:r>
+        <w:rPr/>
+        <w:t xml:space="preserve"> [Modelo de lenguaje grande], utilizado para planeación y revisión de la estrategia del pipeline. </w:t>
+      </w:r>
+      <w:hyperlink r:id="rId54">
         <w:r>
           <w:rPr>
             <w:color w:val="15658B"/>
@@ -8541,9 +8840,147 @@
       </w:hyperlink>
       <w:r>
         <w:rPr/>
+        <w:t xml:space="preserve">.</w:t>
+      </w:r>
+    </w:p>
+    <w:p>
+      <w:pPr>
+        <w:pStyle w:val="ReportBody"/>
+        <w:ind w:left="230" w:hanging="230"/>
+      </w:pPr>
+      <w:r>
+        <w:rPr/>
+        <w:t xml:space="preserve">• </w:t>
+      </w:r>
+      <w:r>
+        <w:rPr>
+          <w:b/>
+        </w:rPr>
+        <w:t xml:space="preserve">Declarado por Leonardo Santos García:</w:t>
+      </w:r>
+      <w:r>
+        <w:rPr/>
+        <w:t xml:space="preserve"> OpenAI. (2026). </w:t>
+      </w:r>
+      <w:r>
+        <w:rPr>
+          <w:i/>
+        </w:rPr>
+        <w:t xml:space="preserve">Codex (basado en GPT-6)</w:t>
+      </w:r>
+      <w:r>
+        <w:rPr/>
+        <w:t xml:space="preserve"> [Modelo de lenguaje grande], utilizado para consulta de fuentes del proyecto, verificación de cifras, revisión técnica y redacción del reporte. </w:t>
+      </w:r>
+      <w:hyperlink r:id="rId55">
+        <w:r>
+          <w:rPr>
+            <w:color w:val="15658B"/>
+          </w:rPr>
+          <w:t xml:space="preserve">Codex</w:t>
+        </w:r>
+      </w:hyperlink>
+      <w:r>
+        <w:rPr/>
+        <w:t xml:space="preserve">.</w:t>
+      </w:r>
+    </w:p>
+    <w:p>
+      <w:pPr>
+        <w:pStyle w:val="ReportBody"/>
+        <w:ind w:left="230" w:hanging="230"/>
+      </w:pPr>
+      <w:r>
+        <w:rPr/>
+        <w:t xml:space="preserve">• </w:t>
+      </w:r>
+      <w:r>
+        <w:rPr>
+          <w:b/>
+        </w:rPr>
+        <w:t xml:space="preserve">Declarado por Equipo 04 — presentación ejecutiva:</w:t>
+      </w:r>
+      <w:r>
+        <w:rPr/>
+        <w:t xml:space="preserve"> Microsoft. (2026). </w:t>
+      </w:r>
+      <w:r>
+        <w:rPr>
+          <w:i/>
+        </w:rPr>
+        <w:t xml:space="preserve">Microsoft 365 Copilot</w:t>
+      </w:r>
+      <w:r>
+        <w:rPr/>
+        <w:t xml:space="preserve"> [Asistente de IA], utilizado para la síntesis, estructura y diseño de la presentación ejecutiva. </w:t>
+      </w:r>
+      <w:hyperlink r:id="rId56">
+        <w:r>
+          <w:rPr>
+            <w:color w:val="15658B"/>
+          </w:rPr>
+          <w:t xml:space="preserve">Microsoft 365 Copilot</w:t>
+        </w:r>
+      </w:hyperlink>
+      <w:r>
+        <w:rPr/>
+        <w:t xml:space="preserve">.</w:t>
+      </w:r>
+    </w:p>
+    <w:p>
+      <w:pPr>
+        <w:pStyle w:val="ReportBody"/>
+      </w:pPr>
+      <w:r>
+        <w:rPr/>
+        <w:t xml:space="preserve">El contenido generado para el notebook 1.04 y su código asociado fue revisado, ejecutado y validado por el integrador, Leonardo Santos García. Las decisiones son del Equipo 04 y el equipo asume la responsabilidad final de lo entregado. La IA se utiliza como apoyo al trabajo de los integrantes y no sustituye la validación técnica ni la responsabilidad sobre los resultados.</w:t>
+      </w:r>
+    </w:p>
+    <w:p>
+      <w:pPr>
+        <w:pStyle w:val="ReportBody"/>
+      </w:pPr>
+      <w:r>
+        <w:rPr/>
+        <w:t xml:space="preserve">Referencias de las herramientas: </w:t>
+      </w:r>
+      <w:hyperlink r:id="rId57">
+        <w:r>
+          <w:rPr>
+            <w:color w:val="15658B"/>
+          </w:rPr>
+          <w:t xml:space="preserve">Gemini</w:t>
+        </w:r>
+      </w:hyperlink>
+      <w:r>
+        <w:rPr/>
+        <w:t xml:space="preserve">, </w:t>
+      </w:r>
+      <w:hyperlink r:id="rId58">
+        <w:r>
+          <w:rPr>
+            <w:color w:val="15658B"/>
+          </w:rPr>
+          <w:t xml:space="preserve">Claude Code</w:t>
+        </w:r>
+      </w:hyperlink>
+      <w:r>
+        <w:rPr/>
+        <w:t xml:space="preserve">, </w:t>
+      </w:r>
+      <w:hyperlink r:id="rId59">
+        <w:r>
+          <w:rPr>
+            <w:color w:val="15658B"/>
+          </w:rPr>
+          <w:t xml:space="preserve">ChatGPT</w:t>
+        </w:r>
+      </w:hyperlink>
+      <w:r>
+        <w:rPr/>
         <w:t xml:space="preserve"> y </w:t>
       </w:r>
-      <w:hyperlink r:id="rId52">
+      <w:hyperlink r:id="rId60">
         <w:r>
           <w:rPr>
             <w:color w:val="15658B"/>
@@ -8702,7 +9139,7 @@
                 <w:sz w:val="18"/>
                 <w:color w:val="15658B"/>
               </w:rPr>
-              <w:t xml:space="preserve">ML Canvas v3</w:t>
+              <w:t xml:space="preserve">ML Canvas v4</w:t>
             </w:r>
           </w:p>
         </w:tc>
@@ -8738,443 +9175,486 @@
             <w:pPr>
               <w:pStyle w:val="ReportTable"/>
             </w:pPr>
-            <w:r>
-              <w:rPr>
-                <w:sz w:val="18"/>
-                <w:color w:val="15658B"/>
-              </w:rPr>
-              <w:t xml:space="preserve">Reporte de diagnóstico</w:t>
-            </w:r>
-          </w:p>
-        </w:tc>
-        <w:tc>
-          <w:tcPr>
-            <w:tcW w:w="5684" w:type="dxa"/>
-            <w:vAlign w:val="center"/>
-          </w:tcPr>
-          <w:p>
-            <w:pPr>
-              <w:pStyle w:val="ReportTable"/>
-            </w:pPr>
-            <w:r>
-              <w:rPr>
-                <w:sz w:val="18"/>
-              </w:rPr>
-              <w:t xml:space="preserve">Cobertura, fuentes y formulación inicial; sus propuestas se contrastan con las decisiones posteriores</w:t>
-            </w:r>
-          </w:p>
-        </w:tc>
-      </w:tr>
-      <w:tr>
-        <w:trPr>
-          <w:cantSplit/>
-        </w:trPr>
-        <w:tc>
-          <w:tcPr>
-            <w:tcW w:w="4287" w:type="dxa"/>
-            <w:vAlign w:val="center"/>
-            <w:shd w:fill="F5F8FA"/>
-          </w:tcPr>
-          <w:p>
-            <w:pPr>
-              <w:pStyle w:val="ReportTable"/>
-            </w:pPr>
-            <w:r>
-              <w:rPr>
-                <w:sz w:val="18"/>
-                <w:color w:val="15658B"/>
-              </w:rPr>
-              <w:t xml:space="preserve">Reporte PR1</w:t>
-            </w:r>
-          </w:p>
-        </w:tc>
-        <w:tc>
-          <w:tcPr>
-            <w:tcW w:w="5684" w:type="dxa"/>
-            <w:vAlign w:val="center"/>
-            <w:shd w:fill="F5F8FA"/>
-          </w:tcPr>
-          <w:p>
-            <w:pPr>
-              <w:pStyle w:val="ReportTable"/>
-            </w:pPr>
-            <w:r>
-              <w:rPr>
-                <w:sz w:val="18"/>
-              </w:rPr>
-              <w:t xml:space="preserve">Preparación, flags, linaje y registro de interim</w:t>
-            </w:r>
-          </w:p>
-        </w:tc>
-      </w:tr>
-      <w:tr>
-        <w:trPr>
-          <w:cantSplit/>
-        </w:trPr>
-        <w:tc>
-          <w:tcPr>
-            <w:tcW w:w="4287" w:type="dxa"/>
-            <w:vAlign w:val="center"/>
-          </w:tcPr>
-          <w:p>
-            <w:pPr>
-              <w:pStyle w:val="ReportTable"/>
-            </w:pPr>
-            <w:r>
-              <w:rPr>
-                <w:sz w:val="18"/>
-                <w:color w:val="15658B"/>
-              </w:rPr>
-              <w:t xml:space="preserve">Reporte PR2</w:t>
-            </w:r>
-          </w:p>
-        </w:tc>
-        <w:tc>
-          <w:tcPr>
-            <w:tcW w:w="5684" w:type="dxa"/>
-            <w:vAlign w:val="center"/>
-          </w:tcPr>
-          <w:p>
-            <w:pPr>
-              <w:pStyle w:val="ReportTable"/>
-            </w:pPr>
-            <w:r>
-              <w:rPr>
-                <w:sz w:val="18"/>
-              </w:rPr>
-              <w:t xml:space="preserve">Integración, decisiones, roles y resultados; el estado final de integración se respalda con el PR #7</w:t>
-            </w:r>
-          </w:p>
-        </w:tc>
-      </w:tr>
-      <w:tr>
-        <w:trPr>
-          <w:cantSplit/>
-        </w:trPr>
-        <w:tc>
-          <w:tcPr>
-            <w:tcW w:w="4287" w:type="dxa"/>
-            <w:vAlign w:val="center"/>
-            <w:shd w:fill="F5F8FA"/>
-          </w:tcPr>
-          <w:p>
-            <w:pPr>
-              <w:pStyle w:val="ReportTable"/>
-            </w:pPr>
-            <w:r>
-              <w:rPr>
-                <w:sz w:val="18"/>
-                <w:color w:val="254960"/>
-                <w:rFonts w:ascii="DejaVu Sans Mono" w:hAnsi="DejaVu Sans Mono"/>
-              </w:rPr>
-              <w:t xml:space="preserve">reports/interim/quality_summary.json</w:t>
-            </w:r>
-            <w:r>
-              <w:rPr>
-                <w:sz w:val="18"/>
-              </w:rPr>
-              <w:t xml:space="preserve"> y </w:t>
-            </w:r>
-            <w:r>
-              <w:rPr>
-                <w:sz w:val="18"/>
-                <w:color w:val="254960"/>
-                <w:rFonts w:ascii="DejaVu Sans Mono" w:hAnsi="DejaVu Sans Mono"/>
-              </w:rPr>
-              <w:t xml:space="preserve">schema.json</w:t>
-            </w:r>
-          </w:p>
-        </w:tc>
-        <w:tc>
-          <w:tcPr>
-            <w:tcW w:w="5684" w:type="dxa"/>
-            <w:vAlign w:val="center"/>
-            <w:shd w:fill="F5F8FA"/>
-          </w:tcPr>
-          <w:p>
-            <w:pPr>
-              <w:pStyle w:val="ReportTable"/>
-            </w:pPr>
-            <w:r>
-              <w:rPr>
-                <w:sz w:val="18"/>
-              </w:rPr>
-              <w:t xml:space="preserve">Conteos y esquema de interim</w:t>
-            </w:r>
-          </w:p>
-        </w:tc>
-      </w:tr>
-      <w:tr>
-        <w:trPr>
-          <w:cantSplit/>
-        </w:trPr>
-        <w:tc>
-          <w:tcPr>
-            <w:tcW w:w="4287" w:type="dxa"/>
-            <w:vAlign w:val="center"/>
-          </w:tcPr>
-          <w:p>
-            <w:pPr>
-              <w:pStyle w:val="ReportTable"/>
-            </w:pPr>
-            <w:r>
-              <w:rPr>
-                <w:sz w:val="18"/>
-                <w:color w:val="254960"/>
-                <w:rFonts w:ascii="DejaVu Sans Mono" w:hAnsi="DejaVu Sans Mono"/>
-              </w:rPr>
-              <w:t xml:space="preserve">reports/station_hour/summary.json</w:t>
-            </w:r>
-          </w:p>
-        </w:tc>
-        <w:tc>
-          <w:tcPr>
-            <w:tcW w:w="5684" w:type="dxa"/>
-            <w:vAlign w:val="center"/>
-          </w:tcPr>
-          <w:p>
-            <w:pPr>
-              <w:pStyle w:val="ReportTable"/>
-            </w:pPr>
-            <w:r>
-              <w:rPr>
-                <w:sz w:val="18"/>
-              </w:rPr>
-              <w:t xml:space="preserve">Dimensiones y distribución de la base de análisis</w:t>
-            </w:r>
-          </w:p>
-        </w:tc>
-      </w:tr>
-      <w:tr>
-        <w:trPr>
-          <w:cantSplit/>
-        </w:trPr>
-        <w:tc>
-          <w:tcPr>
-            <w:tcW w:w="4287" w:type="dxa"/>
-            <w:vAlign w:val="center"/>
-            <w:shd w:fill="F5F8FA"/>
-          </w:tcPr>
-          <w:p>
-            <w:pPr>
-              <w:pStyle w:val="ReportTable"/>
-            </w:pPr>
-            <w:r>
-              <w:rPr>
-                <w:sz w:val="18"/>
-                <w:color w:val="254960"/>
-                <w:rFonts w:ascii="DejaVu Sans Mono" w:hAnsi="DejaVu Sans Mono"/>
-              </w:rPr>
-              <w:t xml:space="preserve">reports/processed/summary.json</w:t>
-            </w:r>
-            <w:r>
-              <w:rPr>
-                <w:sz w:val="18"/>
-              </w:rPr>
-              <w:t xml:space="preserve">, </w:t>
-            </w:r>
-            <w:r>
-              <w:rPr>
-                <w:sz w:val="18"/>
-                <w:color w:val="254960"/>
-                <w:rFonts w:ascii="DejaVu Sans Mono" w:hAnsi="DejaVu Sans Mono"/>
-              </w:rPr>
-              <w:t xml:space="preserve">schema.json</w:t>
-            </w:r>
-            <w:r>
-              <w:rPr>
-                <w:sz w:val="18"/>
-              </w:rPr>
-              <w:t xml:space="preserve"> y </w:t>
-            </w:r>
-            <w:r>
-              <w:rPr>
-                <w:sz w:val="18"/>
-                <w:color w:val="254960"/>
-                <w:rFonts w:ascii="DejaVu Sans Mono" w:hAnsi="DejaVu Sans Mono"/>
-              </w:rPr>
-              <w:t xml:space="preserve">decisions.json</w:t>
-            </w:r>
-          </w:p>
-        </w:tc>
-        <w:tc>
-          <w:tcPr>
-            <w:tcW w:w="5684" w:type="dxa"/>
-            <w:vAlign w:val="center"/>
-            <w:shd w:fill="F5F8FA"/>
-          </w:tcPr>
-          <w:p>
-            <w:pPr>
-              <w:pStyle w:val="ReportTable"/>
-            </w:pPr>
-            <w:r>
-              <w:rPr>
-                <w:sz w:val="18"/>
-              </w:rPr>
-              <w:t xml:space="preserve">Resultado procesado, columnas, reglas y conciliación</w:t>
-            </w:r>
-          </w:p>
-        </w:tc>
-      </w:tr>
-      <w:tr>
-        <w:trPr>
-          <w:cantSplit/>
-        </w:trPr>
-        <w:tc>
-          <w:tcPr>
-            <w:tcW w:w="4287" w:type="dxa"/>
-            <w:vAlign w:val="center"/>
-          </w:tcPr>
-          <w:p>
-            <w:pPr>
-              <w:pStyle w:val="ReportTable"/>
-            </w:pPr>
-            <w:r>
-              <w:rPr>
-                <w:sz w:val="18"/>
-              </w:rPr>
-              <w:t xml:space="preserve">Notebooks 1.01, 1.02, 1.03 y 1.04</w:t>
-            </w:r>
-          </w:p>
-        </w:tc>
-        <w:tc>
-          <w:tcPr>
-            <w:tcW w:w="5684" w:type="dxa"/>
-            <w:vAlign w:val="center"/>
-          </w:tcPr>
-          <w:p>
-            <w:pPr>
-              <w:pStyle w:val="ReportTable"/>
-            </w:pPr>
-            <w:r>
-              <w:rPr>
-                <w:sz w:val="18"/>
-              </w:rPr>
-              <w:t xml:space="preserve">Métodos, figuras, interpretaciones y resultados guardados</w:t>
-            </w:r>
-          </w:p>
-        </w:tc>
-      </w:tr>
-      <w:tr>
-        <w:trPr>
-          <w:cantSplit/>
-        </w:trPr>
-        <w:tc>
-          <w:tcPr>
-            <w:tcW w:w="4287" w:type="dxa"/>
-            <w:vAlign w:val="center"/>
-            <w:shd w:fill="F5F8FA"/>
-          </w:tcPr>
-          <w:p>
-            <w:pPr>
-              <w:pStyle w:val="ReportTable"/>
-            </w:pPr>
-            <w:r>
-              <w:rPr>
-                <w:sz w:val="18"/>
-                <w:color w:val="254960"/>
-                <w:rFonts w:ascii="DejaVu Sans Mono" w:hAnsi="DejaVu Sans Mono"/>
-              </w:rPr>
-              <w:t xml:space="preserve">mibici/</w:t>
-            </w:r>
-            <w:r>
-              <w:rPr>
-                <w:sz w:val="18"/>
-              </w:rPr>
-              <w:t xml:space="preserve">, </w:t>
-            </w:r>
-            <w:r>
-              <w:rPr>
-                <w:sz w:val="18"/>
-                <w:color w:val="254960"/>
-                <w:rFonts w:ascii="DejaVu Sans Mono" w:hAnsi="DejaVu Sans Mono"/>
-              </w:rPr>
-              <w:t xml:space="preserve">tests/</w:t>
-            </w:r>
-            <w:r>
-              <w:rPr>
-                <w:sz w:val="18"/>
-              </w:rPr>
-              <w:t xml:space="preserve">, </w:t>
-            </w:r>
-            <w:r>
-              <w:rPr>
-                <w:sz w:val="18"/>
-                <w:color w:val="254960"/>
-                <w:rFonts w:ascii="DejaVu Sans Mono" w:hAnsi="DejaVu Sans Mono"/>
-              </w:rPr>
-              <w:t xml:space="preserve">Makefile</w:t>
-            </w:r>
-            <w:r>
-              <w:rPr>
-                <w:sz w:val="18"/>
-              </w:rPr>
-              <w:t xml:space="preserve">, </w:t>
-            </w:r>
-            <w:r>
-              <w:rPr>
-                <w:sz w:val="18"/>
-                <w:color w:val="254960"/>
-                <w:rFonts w:ascii="DejaVu Sans Mono" w:hAnsi="DejaVu Sans Mono"/>
-              </w:rPr>
-              <w:t xml:space="preserve">environment.yml</w:t>
-            </w:r>
-            <w:r>
-              <w:rPr>
-                <w:sz w:val="18"/>
-              </w:rPr>
-              <w:t xml:space="preserve"> y README</w:t>
-            </w:r>
-          </w:p>
-        </w:tc>
-        <w:tc>
-          <w:tcPr>
-            <w:tcW w:w="5684" w:type="dxa"/>
-            <w:vAlign w:val="center"/>
-            <w:shd w:fill="F5F8FA"/>
-          </w:tcPr>
-          <w:p>
-            <w:pPr>
-              <w:pStyle w:val="ReportTable"/>
-            </w:pPr>
-            <w:r>
-              <w:rPr>
-                <w:sz w:val="18"/>
-              </w:rPr>
-              <w:t xml:space="preserve">Implementación, ejecución y reproducibilidad</w:t>
-            </w:r>
-          </w:p>
-        </w:tc>
-      </w:tr>
-      <w:tr>
-        <w:trPr>
-          <w:cantSplit/>
-        </w:trPr>
-        <w:tc>
-          <w:tcPr>
-            <w:tcW w:w="4287" w:type="dxa"/>
-            <w:vAlign w:val="center"/>
-          </w:tcPr>
-          <w:p>
-            <w:pPr>
-              <w:pStyle w:val="ReportTable"/>
-            </w:pPr>
-            <w:hyperlink r:id="rId53">
+            <w:hyperlink r:id="rId61">
               <w:r>
                 <w:rPr>
                   <w:sz w:val="18"/>
                   <w:color w:val="15658B"/>
                 </w:rPr>
-                <w:t xml:space="preserve">Historial de `main`</w:t>
+                <w:t xml:space="preserve">MiBici: ¿Cómo funciona?</w:t>
               </w:r>
             </w:hyperlink>
+          </w:p>
+        </w:tc>
+        <w:tc>
+          <w:tcPr>
+            <w:tcW w:w="5684" w:type="dxa"/>
+            <w:vAlign w:val="center"/>
+          </w:tcPr>
+          <w:p>
+            <w:pPr>
+              <w:pStyle w:val="ReportTable"/>
+            </w:pPr>
+            <w:r>
+              <w:rPr>
+                <w:sz w:val="18"/>
+              </w:rPr>
+              <w:t xml:space="preserve">Horario publicado: todos los días de 05:00 a 00:59; consulta del 25 de octubre de 2026</w:t>
+            </w:r>
+          </w:p>
+        </w:tc>
+      </w:tr>
+      <w:tr>
+        <w:trPr>
+          <w:cantSplit/>
+        </w:trPr>
+        <w:tc>
+          <w:tcPr>
+            <w:tcW w:w="4287" w:type="dxa"/>
+            <w:vAlign w:val="center"/>
+            <w:shd w:fill="F5F8FA"/>
+          </w:tcPr>
+          <w:p>
+            <w:pPr>
+              <w:pStyle w:val="ReportTable"/>
+            </w:pPr>
+            <w:r>
+              <w:rPr>
+                <w:sz w:val="18"/>
+                <w:color w:val="15658B"/>
+              </w:rPr>
+              <w:t xml:space="preserve">Reporte de diagnóstico</w:t>
+            </w:r>
+          </w:p>
+        </w:tc>
+        <w:tc>
+          <w:tcPr>
+            <w:tcW w:w="5684" w:type="dxa"/>
+            <w:vAlign w:val="center"/>
+            <w:shd w:fill="F5F8FA"/>
+          </w:tcPr>
+          <w:p>
+            <w:pPr>
+              <w:pStyle w:val="ReportTable"/>
+            </w:pPr>
+            <w:r>
+              <w:rPr>
+                <w:sz w:val="18"/>
+              </w:rPr>
+              <w:t xml:space="preserve">Cobertura, fuentes y formulación inicial; sus propuestas se contrastan con las decisiones posteriores</w:t>
+            </w:r>
+          </w:p>
+        </w:tc>
+      </w:tr>
+      <w:tr>
+        <w:trPr>
+          <w:cantSplit/>
+        </w:trPr>
+        <w:tc>
+          <w:tcPr>
+            <w:tcW w:w="4287" w:type="dxa"/>
+            <w:vAlign w:val="center"/>
+          </w:tcPr>
+          <w:p>
+            <w:pPr>
+              <w:pStyle w:val="ReportTable"/>
+            </w:pPr>
+            <w:r>
+              <w:rPr>
+                <w:sz w:val="18"/>
+                <w:color w:val="15658B"/>
+              </w:rPr>
+              <w:t xml:space="preserve">Reporte PR1</w:t>
+            </w:r>
+          </w:p>
+        </w:tc>
+        <w:tc>
+          <w:tcPr>
+            <w:tcW w:w="5684" w:type="dxa"/>
+            <w:vAlign w:val="center"/>
+          </w:tcPr>
+          <w:p>
+            <w:pPr>
+              <w:pStyle w:val="ReportTable"/>
+            </w:pPr>
+            <w:r>
+              <w:rPr>
+                <w:sz w:val="18"/>
+              </w:rPr>
+              <w:t xml:space="preserve">Preparación, flags, linaje y registro de interim</w:t>
+            </w:r>
+          </w:p>
+        </w:tc>
+      </w:tr>
+      <w:tr>
+        <w:trPr>
+          <w:cantSplit/>
+        </w:trPr>
+        <w:tc>
+          <w:tcPr>
+            <w:tcW w:w="4287" w:type="dxa"/>
+            <w:vAlign w:val="center"/>
+            <w:shd w:fill="F5F8FA"/>
+          </w:tcPr>
+          <w:p>
+            <w:pPr>
+              <w:pStyle w:val="ReportTable"/>
+            </w:pPr>
+            <w:r>
+              <w:rPr>
+                <w:sz w:val="18"/>
+                <w:color w:val="15658B"/>
+              </w:rPr>
+              <w:t xml:space="preserve">Reporte PR2</w:t>
+            </w:r>
+          </w:p>
+        </w:tc>
+        <w:tc>
+          <w:tcPr>
+            <w:tcW w:w="5684" w:type="dxa"/>
+            <w:vAlign w:val="center"/>
+            <w:shd w:fill="F5F8FA"/>
+          </w:tcPr>
+          <w:p>
+            <w:pPr>
+              <w:pStyle w:val="ReportTable"/>
+            </w:pPr>
+            <w:r>
+              <w:rPr>
+                <w:sz w:val="18"/>
+              </w:rPr>
+              <w:t xml:space="preserve">Integración, decisiones, roles y resultados; el estado final de integración se respalda con el PR #7</w:t>
+            </w:r>
+          </w:p>
+        </w:tc>
+      </w:tr>
+      <w:tr>
+        <w:trPr>
+          <w:cantSplit/>
+        </w:trPr>
+        <w:tc>
+          <w:tcPr>
+            <w:tcW w:w="4287" w:type="dxa"/>
+            <w:vAlign w:val="center"/>
+          </w:tcPr>
+          <w:p>
+            <w:pPr>
+              <w:pStyle w:val="ReportTable"/>
+            </w:pPr>
+            <w:r>
+              <w:rPr>
+                <w:sz w:val="18"/>
+                <w:color w:val="254960"/>
+                <w:rFonts w:ascii="DejaVu Sans Mono" w:hAnsi="DejaVu Sans Mono"/>
+              </w:rPr>
+              <w:t xml:space="preserve">reports/interim/quality_summary.json</w:t>
+            </w:r>
+            <w:r>
+              <w:rPr>
+                <w:sz w:val="18"/>
+              </w:rPr>
+              <w:t xml:space="preserve"> y </w:t>
+            </w:r>
+            <w:r>
+              <w:rPr>
+                <w:sz w:val="18"/>
+                <w:color w:val="254960"/>
+                <w:rFonts w:ascii="DejaVu Sans Mono" w:hAnsi="DejaVu Sans Mono"/>
+              </w:rPr>
+              <w:t xml:space="preserve">schema.json</w:t>
+            </w:r>
+          </w:p>
+        </w:tc>
+        <w:tc>
+          <w:tcPr>
+            <w:tcW w:w="5684" w:type="dxa"/>
+            <w:vAlign w:val="center"/>
+          </w:tcPr>
+          <w:p>
+            <w:pPr>
+              <w:pStyle w:val="ReportTable"/>
+            </w:pPr>
+            <w:r>
+              <w:rPr>
+                <w:sz w:val="18"/>
+              </w:rPr>
+              <w:t xml:space="preserve">Conteos y esquema de interim</w:t>
+            </w:r>
+          </w:p>
+        </w:tc>
+      </w:tr>
+      <w:tr>
+        <w:trPr>
+          <w:cantSplit/>
+        </w:trPr>
+        <w:tc>
+          <w:tcPr>
+            <w:tcW w:w="4287" w:type="dxa"/>
+            <w:vAlign w:val="center"/>
+            <w:shd w:fill="F5F8FA"/>
+          </w:tcPr>
+          <w:p>
+            <w:pPr>
+              <w:pStyle w:val="ReportTable"/>
+            </w:pPr>
+            <w:r>
+              <w:rPr>
+                <w:sz w:val="18"/>
+                <w:color w:val="254960"/>
+                <w:rFonts w:ascii="DejaVu Sans Mono" w:hAnsi="DejaVu Sans Mono"/>
+              </w:rPr>
+              <w:t xml:space="preserve">reports/station_hour/summary.json</w:t>
+            </w:r>
+          </w:p>
+        </w:tc>
+        <w:tc>
+          <w:tcPr>
+            <w:tcW w:w="5684" w:type="dxa"/>
+            <w:vAlign w:val="center"/>
+            <w:shd w:fill="F5F8FA"/>
+          </w:tcPr>
+          <w:p>
+            <w:pPr>
+              <w:pStyle w:val="ReportTable"/>
+            </w:pPr>
+            <w:r>
+              <w:rPr>
+                <w:sz w:val="18"/>
+              </w:rPr>
+              <w:t xml:space="preserve">Dimensiones y distribución de la base de análisis</w:t>
+            </w:r>
+          </w:p>
+        </w:tc>
+      </w:tr>
+      <w:tr>
+        <w:trPr>
+          <w:cantSplit/>
+        </w:trPr>
+        <w:tc>
+          <w:tcPr>
+            <w:tcW w:w="4287" w:type="dxa"/>
+            <w:vAlign w:val="center"/>
+          </w:tcPr>
+          <w:p>
+            <w:pPr>
+              <w:pStyle w:val="ReportTable"/>
+            </w:pPr>
+            <w:r>
+              <w:rPr>
+                <w:sz w:val="18"/>
+                <w:color w:val="254960"/>
+                <w:rFonts w:ascii="DejaVu Sans Mono" w:hAnsi="DejaVu Sans Mono"/>
+              </w:rPr>
+              <w:t xml:space="preserve">reports/processed/summary.json</w:t>
+            </w:r>
             <w:r>
               <w:rPr>
                 <w:sz w:val="18"/>
               </w:rPr>
               <w:t xml:space="preserve">, </w:t>
             </w:r>
-            <w:hyperlink r:id="rId54">
+            <w:r>
+              <w:rPr>
+                <w:sz w:val="18"/>
+                <w:color w:val="254960"/>
+                <w:rFonts w:ascii="DejaVu Sans Mono" w:hAnsi="DejaVu Sans Mono"/>
+              </w:rPr>
+              <w:t xml:space="preserve">schema.json</w:t>
+            </w:r>
+            <w:r>
+              <w:rPr>
+                <w:sz w:val="18"/>
+              </w:rPr>
+              <w:t xml:space="preserve"> y </w:t>
+            </w:r>
+            <w:r>
+              <w:rPr>
+                <w:sz w:val="18"/>
+                <w:color w:val="254960"/>
+                <w:rFonts w:ascii="DejaVu Sans Mono" w:hAnsi="DejaVu Sans Mono"/>
+              </w:rPr>
+              <w:t xml:space="preserve">decisions.json</w:t>
+            </w:r>
+          </w:p>
+        </w:tc>
+        <w:tc>
+          <w:tcPr>
+            <w:tcW w:w="5684" w:type="dxa"/>
+            <w:vAlign w:val="center"/>
+          </w:tcPr>
+          <w:p>
+            <w:pPr>
+              <w:pStyle w:val="ReportTable"/>
+            </w:pPr>
+            <w:r>
+              <w:rPr>
+                <w:sz w:val="18"/>
+              </w:rPr>
+              <w:t xml:space="preserve">Resultado procesado, columnas, reglas y conciliación</w:t>
+            </w:r>
+          </w:p>
+        </w:tc>
+      </w:tr>
+      <w:tr>
+        <w:trPr>
+          <w:cantSplit/>
+        </w:trPr>
+        <w:tc>
+          <w:tcPr>
+            <w:tcW w:w="4287" w:type="dxa"/>
+            <w:vAlign w:val="center"/>
+            <w:shd w:fill="F5F8FA"/>
+          </w:tcPr>
+          <w:p>
+            <w:pPr>
+              <w:pStyle w:val="ReportTable"/>
+            </w:pPr>
+            <w:r>
+              <w:rPr>
+                <w:sz w:val="18"/>
+              </w:rPr>
+              <w:t xml:space="preserve">Notebooks 1.01, 1.02, 1.03 y 1.04</w:t>
+            </w:r>
+          </w:p>
+        </w:tc>
+        <w:tc>
+          <w:tcPr>
+            <w:tcW w:w="5684" w:type="dxa"/>
+            <w:vAlign w:val="center"/>
+            <w:shd w:fill="F5F8FA"/>
+          </w:tcPr>
+          <w:p>
+            <w:pPr>
+              <w:pStyle w:val="ReportTable"/>
+            </w:pPr>
+            <w:r>
+              <w:rPr>
+                <w:sz w:val="18"/>
+              </w:rPr>
+              <w:t xml:space="preserve">Métodos, figuras, interpretaciones y resultados guardados</w:t>
+            </w:r>
+          </w:p>
+        </w:tc>
+      </w:tr>
+      <w:tr>
+        <w:trPr>
+          <w:cantSplit/>
+        </w:trPr>
+        <w:tc>
+          <w:tcPr>
+            <w:tcW w:w="4287" w:type="dxa"/>
+            <w:vAlign w:val="center"/>
+          </w:tcPr>
+          <w:p>
+            <w:pPr>
+              <w:pStyle w:val="ReportTable"/>
+            </w:pPr>
+            <w:r>
+              <w:rPr>
+                <w:sz w:val="18"/>
+                <w:color w:val="254960"/>
+                <w:rFonts w:ascii="DejaVu Sans Mono" w:hAnsi="DejaVu Sans Mono"/>
+              </w:rPr>
+              <w:t xml:space="preserve">mibici/</w:t>
+            </w:r>
+            <w:r>
+              <w:rPr>
+                <w:sz w:val="18"/>
+              </w:rPr>
+              <w:t xml:space="preserve">, </w:t>
+            </w:r>
+            <w:r>
+              <w:rPr>
+                <w:sz w:val="18"/>
+                <w:color w:val="254960"/>
+                <w:rFonts w:ascii="DejaVu Sans Mono" w:hAnsi="DejaVu Sans Mono"/>
+              </w:rPr>
+              <w:t xml:space="preserve">tests/</w:t>
+            </w:r>
+            <w:r>
+              <w:rPr>
+                <w:sz w:val="18"/>
+              </w:rPr>
+              <w:t xml:space="preserve">, </w:t>
+            </w:r>
+            <w:r>
+              <w:rPr>
+                <w:sz w:val="18"/>
+                <w:color w:val="254960"/>
+                <w:rFonts w:ascii="DejaVu Sans Mono" w:hAnsi="DejaVu Sans Mono"/>
+              </w:rPr>
+              <w:t xml:space="preserve">Makefile</w:t>
+            </w:r>
+            <w:r>
+              <w:rPr>
+                <w:sz w:val="18"/>
+              </w:rPr>
+              <w:t xml:space="preserve">, </w:t>
+            </w:r>
+            <w:r>
+              <w:rPr>
+                <w:sz w:val="18"/>
+                <w:color w:val="254960"/>
+                <w:rFonts w:ascii="DejaVu Sans Mono" w:hAnsi="DejaVu Sans Mono"/>
+              </w:rPr>
+              <w:t xml:space="preserve">environment.yml</w:t>
+            </w:r>
+            <w:r>
+              <w:rPr>
+                <w:sz w:val="18"/>
+              </w:rPr>
+              <w:t xml:space="preserve"> y README</w:t>
+            </w:r>
+          </w:p>
+        </w:tc>
+        <w:tc>
+          <w:tcPr>
+            <w:tcW w:w="5684" w:type="dxa"/>
+            <w:vAlign w:val="center"/>
+          </w:tcPr>
+          <w:p>
+            <w:pPr>
+              <w:pStyle w:val="ReportTable"/>
+            </w:pPr>
+            <w:r>
+              <w:rPr>
+                <w:sz w:val="18"/>
+              </w:rPr>
+              <w:t xml:space="preserve">Implementación, ejecución y reproducibilidad</w:t>
+            </w:r>
+          </w:p>
+        </w:tc>
+      </w:tr>
+      <w:tr>
+        <w:trPr>
+          <w:cantSplit/>
+        </w:trPr>
+        <w:tc>
+          <w:tcPr>
+            <w:tcW w:w="4287" w:type="dxa"/>
+            <w:vAlign w:val="center"/>
+            <w:shd w:fill="F5F8FA"/>
+          </w:tcPr>
+          <w:p>
+            <w:pPr>
+              <w:pStyle w:val="ReportTable"/>
+            </w:pPr>
+            <w:hyperlink r:id="rId62">
+              <w:r>
+                <w:rPr>
+                  <w:sz w:val="18"/>
+                  <w:color w:val="15658B"/>
+                </w:rPr>
+                <w:t xml:space="preserve">Historial de main</w:t>
+              </w:r>
+            </w:hyperlink>
+            <w:r>
+              <w:rPr>
+                <w:sz w:val="18"/>
+              </w:rPr>
+              <w:t xml:space="preserve">, </w:t>
+            </w:r>
+            <w:hyperlink r:id="rId63">
               <w:r>
                 <w:rPr>
                   <w:sz w:val="18"/>
@@ -9203,6 +9683,7 @@
           <w:tcPr>
             <w:tcW w:w="5684" w:type="dxa"/>
             <w:vAlign w:val="center"/>
+            <w:shd w:fill="F5F8FA"/>
           </w:tcPr>
           <w:p>
             <w:pPr>

</xml_diff>